<commit_message>
fix: preserve initial pose for test1
</commit_message>
<xml_diff>
--- a/docs/实验1报告.docx
+++ b/docs/实验1报告.docx
@@ -1352,6 +1352,39 @@
               <w:t>.\build\tests\training_main.exe --gtest_filter=ExecutorTest.should_return_init_pose_when_without_command</w:t>
             </w:r>
           </w:p>
+          <w:p>
+            <w:pPr>
+              <w:spacing w:after="40" w:line="252" w:lineRule="auto"/>
+            </w:pPr>
+            <w:r>
+              <w:rPr>
+                <w:sz w:val="21"/>
+              </w:rPr>
+              <w:t>7. 实现指定状态初始化</w:t>
+            </w:r>
+          </w:p>
+          <w:p>
+            <w:pPr>
+              <w:spacing w:after="40" w:line="252" w:lineRule="auto"/>
+            </w:pPr>
+            <w:r>
+              <w:rPr>
+                <w:sz w:val="21"/>
+              </w:rPr>
+              <w:t>确认用例1出现预期失败后，将ExecutorImpl构造函数改为通过成员初始化列表pose(initialPose)保存传入状态，并移除临时固定状态。Query()保持返回成员状态，测试断言不变。</w:t>
+            </w:r>
+          </w:p>
+          <w:p>
+            <w:pPr>
+              <w:spacing w:after="40" w:line="252" w:lineRule="auto"/>
+            </w:pPr>
+            <w:r>
+              <w:rPr>
+                <w:sz w:val="21"/>
+              </w:rPr>
+              <w:t>修改后重新编译并运行同一个用例。验收要求为(0,0,E)的三个字段均符合期望，测试汇总显示1个用例通过。</w:t>
+            </w:r>
+          </w:p>
         </w:tc>
       </w:tr>
       <w:tr>
@@ -1451,7 +1484,7 @@
                 <w:b w:val="0"/>
                 <w:sz w:val="21"/>
               </w:rPr>
-              <w:t>实际运行结果：________________________</w:t>
+              <w:t>首次实际运行结果：执行1个测试，0个通过、1个失败。失败位于ExecutorTest.cpp第19行，期望朝向E，实际朝向N；与测试先行版本的预期一致。</w:t>
             </w:r>
           </w:p>
           <w:p>
@@ -1499,7 +1532,7 @@
                 <w:b w:val="0"/>
                 <w:sz w:val="21"/>
               </w:rPr>
-              <w:t>结果分析记录：________________________</w:t>
+              <w:t>结果分析：构造函数未保存传入状态，导致查询结果中的朝向仍为临时值N。修正方式为在构造时保存完整Pose。修改后复测结果：________________________</w:t>
             </w:r>
           </w:p>
         </w:tc>
@@ -1553,7 +1586,7 @@
                 <w:b w:val="0"/>
                 <w:sz w:val="21"/>
               </w:rPr>
-              <w:t>用例1验收结论：________________________</w:t>
+              <w:t>用例1已验证测试能够识别初始化错误。功能修正后的验收结果：________________________</w:t>
             </w:r>
           </w:p>
         </w:tc>

</xml_diff>

<commit_message>
docs: record test1 pass with failure and success screenshots
</commit_message>
<xml_diff>
--- a/docs/实验1报告.docx
+++ b/docs/实验1报告.docx
@@ -772,6 +772,8 @@
             </w:pPr>
             <w:r>
               <w:rPr>
+                <w:rFonts w:ascii="宋体" w:hAnsi="宋体" w:eastAsia="宋体"/>
+                <w:b/>
                 <w:sz w:val="21"/>
               </w:rPr>
             </w:r>
@@ -826,6 +828,8 @@
             </w:pPr>
             <w:r>
               <w:rPr>
+                <w:rFonts w:ascii="宋体" w:hAnsi="宋体" w:eastAsia="宋体"/>
+                <w:b/>
                 <w:sz w:val="21"/>
               </w:rPr>
             </w:r>
@@ -912,6 +916,8 @@
             </w:pPr>
             <w:r>
               <w:rPr>
+                <w:rFonts w:ascii="宋体" w:hAnsi="宋体" w:eastAsia="宋体"/>
+                <w:b/>
                 <w:sz w:val="21"/>
               </w:rPr>
             </w:r>
@@ -982,6 +988,8 @@
             </w:pPr>
             <w:r>
               <w:rPr>
+                <w:rFonts w:ascii="宋体" w:hAnsi="宋体" w:eastAsia="宋体"/>
+                <w:b/>
                 <w:sz w:val="21"/>
               </w:rPr>
             </w:r>
@@ -1068,6 +1076,8 @@
             </w:pPr>
             <w:r>
               <w:rPr>
+                <w:rFonts w:ascii="宋体" w:hAnsi="宋体" w:eastAsia="宋体"/>
+                <w:b/>
                 <w:sz w:val="21"/>
               </w:rPr>
             </w:r>
@@ -1354,10 +1364,13 @@
           </w:p>
           <w:p>
             <w:pPr>
+              <w:keepNext w:val="0"/>
+              <w:keepLines w:val="0"/>
               <w:spacing w:after="40" w:line="252" w:lineRule="auto"/>
             </w:pPr>
             <w:r>
               <w:rPr>
+                <w:rFonts w:ascii="宋体" w:hAnsi="宋体" w:eastAsia="宋体"/>
                 <w:sz w:val="21"/>
               </w:rPr>
               <w:t>7. 实现指定状态初始化</w:t>
@@ -1365,10 +1378,13 @@
           </w:p>
           <w:p>
             <w:pPr>
+              <w:keepNext w:val="0"/>
+              <w:keepLines w:val="0"/>
               <w:spacing w:after="40" w:line="252" w:lineRule="auto"/>
             </w:pPr>
             <w:r>
               <w:rPr>
+                <w:rFonts w:ascii="宋体" w:hAnsi="宋体" w:eastAsia="宋体"/>
                 <w:sz w:val="21"/>
               </w:rPr>
               <w:t>确认用例1出现预期失败后，将ExecutorImpl构造函数改为通过成员初始化列表pose(initialPose)保存传入状态，并移除临时固定状态。Query()保持返回成员状态，测试断言不变。</w:t>
@@ -1376,10 +1392,13 @@
           </w:p>
           <w:p>
             <w:pPr>
+              <w:keepNext w:val="0"/>
+              <w:keepLines w:val="0"/>
               <w:spacing w:after="40" w:line="252" w:lineRule="auto"/>
             </w:pPr>
             <w:r>
               <w:rPr>
+                <w:rFonts w:ascii="宋体" w:hAnsi="宋体" w:eastAsia="宋体"/>
                 <w:sz w:val="21"/>
               </w:rPr>
               <w:t>修改后重新编译并运行同一个用例。验收要求为(0,0,E)的三个字段均符合期望，测试汇总显示1个用例通过。</w:t>
@@ -1406,20 +1425,21 @@
             <w:pPr>
               <w:keepNext w:val="0"/>
               <w:keepLines w:val="0"/>
-              <w:pageBreakBefore w:val="0"/>
               <w:spacing w:after="40" w:line="252" w:lineRule="auto"/>
             </w:pPr>
             <w:r>
               <w:rPr>
-                <w:sz w:val="21"/>
-              </w:rPr>
-            </w:r>
-            <w:r>
-              <w:rPr>
                 <w:rFonts w:ascii="宋体" w:hAnsi="宋体" w:eastAsia="宋体"/>
                 <w:b/>
                 <w:sz w:val="21"/>
               </w:rPr>
+            </w:r>
+            <w:r>
+              <w:rPr>
+                <w:rFonts w:ascii="宋体" w:hAnsi="宋体" w:eastAsia="宋体"/>
+                <w:b/>
+                <w:sz w:val="21"/>
+              </w:rPr>
               <w:t>八、实验数据及结果分析：</w:t>
             </w:r>
           </w:p>
@@ -1427,112 +1447,174 @@
             <w:pPr>
               <w:keepNext w:val="0"/>
               <w:keepLines w:val="0"/>
-              <w:pageBreakBefore w:val="0"/>
               <w:spacing w:after="40" w:line="252" w:lineRule="auto"/>
             </w:pPr>
             <w:r>
               <w:rPr>
                 <w:rFonts w:ascii="宋体" w:hAnsi="宋体" w:eastAsia="宋体"/>
-                <w:b w:val="0"/>
-                <w:sz w:val="21"/>
-              </w:rPr>
-              <w:t>用例1输入：(0,0,E)；指令：无。</w:t>
-            </w:r>
-          </w:p>
-          <w:p>
-            <w:pPr>
-              <w:keepNext w:val="0"/>
-              <w:keepLines w:val="0"/>
-              <w:pageBreakBefore w:val="0"/>
+                <w:sz w:val="21"/>
+              </w:rPr>
+              <w:t>用例1：指定初始状态，不执行指令。输入为(0,0,E)，期望查询结果为(0,0,E)。</w:t>
+            </w:r>
+          </w:p>
+          <w:p>
+            <w:pPr>
+              <w:keepNext w:val="0"/>
+              <w:keepLines w:val="0"/>
               <w:spacing w:after="40" w:line="252" w:lineRule="auto"/>
             </w:pPr>
             <w:r>
               <w:rPr>
                 <w:rFonts w:ascii="宋体" w:hAnsi="宋体" w:eastAsia="宋体"/>
-                <w:b w:val="0"/>
-                <w:sz w:val="21"/>
-              </w:rPr>
-              <w:t>需求期望：x=0，y=0，heading=E。</w:t>
-            </w:r>
-          </w:p>
-          <w:p>
-            <w:pPr>
-              <w:keepNext w:val="0"/>
-              <w:keepLines w:val="0"/>
-              <w:pageBreakBefore w:val="0"/>
+                <w:sz w:val="21"/>
+              </w:rPr>
+              <w:t>首次运行：1个测试失败。第19行朝向断言期望E，实际为N，说明构造函数未保存传入的状态。</w:t>
+            </w:r>
+          </w:p>
+          <w:p>
+            <w:pPr>
+              <w:keepNext/>
+              <w:keepLines w:val="0"/>
               <w:spacing w:after="40" w:line="252" w:lineRule="auto"/>
             </w:pPr>
             <w:r>
               <w:rPr>
                 <w:rFonts w:ascii="宋体" w:hAnsi="宋体" w:eastAsia="宋体"/>
-                <w:b w:val="0"/>
-                <w:sz w:val="21"/>
-              </w:rPr>
-              <w:t>测试先行版本的预期表现：x、y断言通过，heading断言失败，因为实现暂时返回N。该失败用于检查测试能否发现初始化数据未保存的问题。</w:t>
-            </w:r>
-          </w:p>
-          <w:p>
-            <w:pPr>
-              <w:keepNext w:val="0"/>
-              <w:keepLines w:val="0"/>
-              <w:pageBreakBefore w:val="0"/>
+                <w:sz w:val="21"/>
+              </w:rPr>
+              <w:t>图1 用例1首次运行：预期失败</w:t>
+            </w:r>
+          </w:p>
+          <w:p>
+            <w:pPr>
+              <w:keepNext w:val="0"/>
+              <w:keepLines w:val="0"/>
               <w:spacing w:after="40" w:line="252" w:lineRule="auto"/>
             </w:pPr>
             <w:r>
               <w:rPr>
                 <w:rFonts w:ascii="宋体" w:hAnsi="宋体" w:eastAsia="宋体"/>
-                <w:b w:val="0"/>
-                <w:sz w:val="21"/>
-              </w:rPr>
-              <w:t>首次实际运行结果：执行1个测试，0个通过、1个失败。失败位于ExecutorTest.cpp第19行，期望朝向E，实际朝向N；与测试先行版本的预期一致。</w:t>
-            </w:r>
-          </w:p>
-          <w:p>
-            <w:pPr>
-              <w:keepNext w:val="0"/>
-              <w:keepLines w:val="0"/>
-              <w:pageBreakBefore w:val="0"/>
+                <w:sz w:val="21"/>
+              </w:rPr>
+              <w:drawing>
+                <wp:inline xmlns:a="http://schemas.openxmlformats.org/drawingml/2006/main" xmlns:pic="http://schemas.openxmlformats.org/drawingml/2006/picture">
+                  <wp:extent cx="5120640" cy="2611763"/>
+                  <wp:docPr id="1" name="Picture 1"/>
+                  <wp:cNvGraphicFramePr>
+                    <a:graphicFrameLocks noChangeAspect="1"/>
+                  </wp:cNvGraphicFramePr>
+                  <a:graphic>
+                    <a:graphicData uri="http://schemas.openxmlformats.org/drawingml/2006/picture">
+                      <pic:pic>
+                        <pic:nvPicPr>
+                          <pic:cNvPr id="0" name="codex-clipboard-21d55351-0335-4c27-a14b-ef2a2ce060ce.png"/>
+                          <pic:cNvPicPr/>
+                        </pic:nvPicPr>
+                        <pic:blipFill>
+                          <a:blip r:embed="rId9"/>
+                          <a:stretch>
+                            <a:fillRect/>
+                          </a:stretch>
+                        </pic:blipFill>
+                        <pic:spPr>
+                          <a:xfrm>
+                            <a:off x="0" y="0"/>
+                            <a:ext cx="5120640" cy="2611763"/>
+                          </a:xfrm>
+                          <a:prstGeom prst="rect"/>
+                        </pic:spPr>
+                      </pic:pic>
+                    </a:graphicData>
+                  </a:graphic>
+                </wp:inline>
+              </w:drawing>
+            </w:r>
+          </w:p>
+          <w:p>
+            <w:pPr>
+              <w:keepNext w:val="0"/>
+              <w:keepLines w:val="0"/>
               <w:spacing w:after="40" w:line="252" w:lineRule="auto"/>
             </w:pPr>
             <w:r>
               <w:rPr>
                 <w:rFonts w:ascii="宋体" w:hAnsi="宋体" w:eastAsia="宋体"/>
-                <w:b w:val="0"/>
-                <w:sz w:val="21"/>
-              </w:rPr>
-              <w:t>运行截图：</w:t>
-            </w:r>
-          </w:p>
-          <w:p>
-            <w:pPr>
-              <w:keepNext w:val="0"/>
-              <w:keepLines w:val="0"/>
-              <w:pageBreakBefore w:val="0"/>
+                <w:sz w:val="21"/>
+              </w:rPr>
+              <w:t>修正构造函数，使用pose(initialPose)保存传入状态后重新编译运行。结果为1个测试通过，三个状态字段均符合期望。</w:t>
+            </w:r>
+          </w:p>
+          <w:p>
+            <w:pPr>
+              <w:keepNext/>
+              <w:keepLines w:val="0"/>
               <w:spacing w:after="40" w:line="252" w:lineRule="auto"/>
             </w:pPr>
             <w:r>
               <w:rPr>
                 <w:rFonts w:ascii="宋体" w:hAnsi="宋体" w:eastAsia="宋体"/>
-                <w:b w:val="0"/>
-                <w:sz w:val="21"/>
-              </w:rPr>
-              <w:t>（在此插入用例1运行截图）</w:t>
-            </w:r>
-          </w:p>
-          <w:p>
-            <w:pPr>
-              <w:keepNext w:val="0"/>
-              <w:keepLines w:val="0"/>
-              <w:pageBreakBefore w:val="0"/>
+                <w:sz w:val="21"/>
+              </w:rPr>
+              <w:t>图2 用例1修正后：测试通过</w:t>
+            </w:r>
+          </w:p>
+          <w:p>
+            <w:pPr>
+              <w:keepNext w:val="0"/>
+              <w:keepLines w:val="0"/>
               <w:spacing w:after="40" w:line="252" w:lineRule="auto"/>
             </w:pPr>
             <w:r>
               <w:rPr>
                 <w:rFonts w:ascii="宋体" w:hAnsi="宋体" w:eastAsia="宋体"/>
-                <w:b w:val="0"/>
-                <w:sz w:val="21"/>
-              </w:rPr>
-              <w:t>结果分析：构造函数未保存传入状态，导致查询结果中的朝向仍为临时值N。修正方式为在构造时保存完整Pose。修改后复测结果：________________________</w:t>
+                <w:sz w:val="21"/>
+              </w:rPr>
+              <w:drawing>
+                <wp:inline xmlns:a="http://schemas.openxmlformats.org/drawingml/2006/main" xmlns:pic="http://schemas.openxmlformats.org/drawingml/2006/picture">
+                  <wp:extent cx="5120640" cy="1414759"/>
+                  <wp:docPr id="2" name="Picture 2"/>
+                  <wp:cNvGraphicFramePr>
+                    <a:graphicFrameLocks noChangeAspect="1"/>
+                  </wp:cNvGraphicFramePr>
+                  <a:graphic>
+                    <a:graphicData uri="http://schemas.openxmlformats.org/drawingml/2006/picture">
+                      <pic:pic>
+                        <pic:nvPicPr>
+                          <pic:cNvPr id="0" name="codex-clipboard-7972200a-d61c-457e-bba7-15292abb671e.png"/>
+                          <pic:cNvPicPr/>
+                        </pic:nvPicPr>
+                        <pic:blipFill>
+                          <a:blip r:embed="rId10"/>
+                          <a:stretch>
+                            <a:fillRect/>
+                          </a:stretch>
+                        </pic:blipFill>
+                        <pic:spPr>
+                          <a:xfrm>
+                            <a:off x="0" y="0"/>
+                            <a:ext cx="5120640" cy="1414759"/>
+                          </a:xfrm>
+                          <a:prstGeom prst="rect"/>
+                        </pic:spPr>
+                      </pic:pic>
+                    </a:graphicData>
+                  </a:graphic>
+                </wp:inline>
+              </w:drawing>
+            </w:r>
+          </w:p>
+          <w:p>
+            <w:pPr>
+              <w:keepNext w:val="0"/>
+              <w:keepLines w:val="0"/>
+              <w:spacing w:after="40" w:line="252" w:lineRule="auto"/>
+            </w:pPr>
+            <w:r>
+              <w:rPr>
+                <w:rFonts w:ascii="宋体" w:hAnsi="宋体" w:eastAsia="宋体"/>
+                <w:sz w:val="21"/>
+              </w:rPr>
+              <w:t>分析：测试断言保持不变，修正状态保存逻辑后由失败变为通过，验证了指定初始状态的创建和查询功能。</w:t>
             </w:r>
           </w:p>
         </w:tc>
@@ -1556,37 +1638,17 @@
             <w:pPr>
               <w:keepNext w:val="0"/>
               <w:keepLines w:val="0"/>
-              <w:pageBreakBefore w:val="0"/>
               <w:spacing w:after="40" w:line="252" w:lineRule="auto"/>
             </w:pPr>
             <w:r>
               <w:rPr>
-                <w:sz w:val="21"/>
-              </w:rPr>
-            </w:r>
-            <w:r>
-              <w:rPr>
                 <w:rFonts w:ascii="宋体" w:hAnsi="宋体" w:eastAsia="宋体"/>
                 <w:b/>
                 <w:sz w:val="21"/>
               </w:rPr>
               <w:t>九、实验结论：</w:t>
-            </w:r>
-          </w:p>
-          <w:p>
-            <w:pPr>
-              <w:keepNext w:val="0"/>
-              <w:keepLines w:val="0"/>
-              <w:pageBreakBefore w:val="0"/>
-              <w:spacing w:after="40" w:line="252" w:lineRule="auto"/>
-            </w:pPr>
-            <w:r>
-              <w:rPr>
-                <w:rFonts w:ascii="宋体" w:hAnsi="宋体" w:eastAsia="宋体"/>
-                <w:b w:val="0"/>
-                <w:sz w:val="21"/>
-              </w:rPr>
-              <w:t>用例1已验证测试能够识别初始化错误。功能修正后的验收结果：________________________</w:t>
+              <w:br/>
+              <w:t>用例1验收通过。执行器能够保存指定的初始位置和朝向，在未执行指令时正确返回(0,0,E)。</w:t>
             </w:r>
           </w:p>
         </w:tc>
@@ -1615,6 +1677,8 @@
             </w:pPr>
             <w:r>
               <w:rPr>
+                <w:rFonts w:ascii="宋体" w:hAnsi="宋体" w:eastAsia="宋体"/>
+                <w:b/>
                 <w:sz w:val="21"/>
               </w:rPr>
             </w:r>
@@ -1669,6 +1733,8 @@
             </w:pPr>
             <w:r>
               <w:rPr>
+                <w:rFonts w:ascii="宋体" w:hAnsi="宋体" w:eastAsia="宋体"/>
+                <w:b/>
                 <w:sz w:val="21"/>
               </w:rPr>
             </w:r>

</xml_diff>

<commit_message>
docs: record verified 14-case runs and screenshots
</commit_message>
<xml_diff>
--- a/docs/实验1报告.docx
+++ b/docs/实验1报告.docx
@@ -981,102 +981,20 @@
             <w:gridSpan w:val="2"/>
           </w:tcPr>
           <w:p>
-            <w:pPr>
-              <w:spacing w:after="40" w:line="252" w:lineRule="auto"/>
-              <w:jc w:val="left"/>
-            </w:pPr>
-            <w:r/>
             <w:r>
               <w:rPr>
                 <w:rFonts w:ascii="宋体" w:hAnsi="宋体" w:eastAsia="宋体"/>
-                <w:b/>
                 <w:sz w:val="21"/>
               </w:rPr>
               <w:t>六、实验步骤及操作：</w:t>
-            </w:r>
-          </w:p>
-          <w:p>
-            <w:pPr>
-              <w:spacing w:after="40" w:line="252" w:lineRule="auto"/>
-              <w:jc w:val="left"/>
-            </w:pPr>
-            <w:r>
-              <w:rPr>
-                <w:rFonts w:ascii="宋体" w:hAnsi="宋体" w:eastAsia="宋体"/>
-                <w:b w:val="0"/>
-                <w:sz w:val="21"/>
-              </w:rPr>
-              <w:t>1. 保留main初始工程；删除旧的test1～test13分支。新增Executor接口、Pose数据结构、ExecutorImpl实现及ExecutorTest测试文件。</w:t>
-            </w:r>
-          </w:p>
-          <w:p>
-            <w:pPr>
-              <w:spacing w:after="40" w:line="252" w:lineRule="auto"/>
-              <w:jc w:val="left"/>
-            </w:pPr>
-            <w:r>
-              <w:rPr>
-                <w:rFonts w:ascii="宋体" w:hAnsi="宋体" w:eastAsia="宋体"/>
-                <w:b w:val="0"/>
-                <w:sz w:val="21"/>
-              </w:rPr>
-              <w:t>2. 对每个用例先建立testN-fail分支，提交当前测试和未满足该测试的实现；再由该分支建立testN分支，补全对应功能并提交。两个分支均上传远程仓库。</w:t>
-            </w:r>
-          </w:p>
-          <w:p>
-            <w:pPr>
-              <w:spacing w:after="40" w:line="252" w:lineRule="auto"/>
-              <w:jc w:val="left"/>
-            </w:pPr>
-            <w:r>
-              <w:rPr>
-                <w:rFonts w:ascii="宋体" w:hAnsi="宋体" w:eastAsia="宋体"/>
-                <w:b w:val="0"/>
-                <w:sz w:val="21"/>
-              </w:rPr>
-              <w:t>3. GoogleTest测试套件命名为Test01～Test14。每次切换分支后构建training_main，只执行当前编号的测试，保留失败、通过两张截图。</w:t>
-            </w:r>
-          </w:p>
-          <w:p>
-            <w:pPr>
-              <w:spacing w:after="40" w:line="252" w:lineRule="auto"/>
-              <w:jc w:val="left"/>
-            </w:pPr>
-            <w:r>
-              <w:rPr>
-                <w:rFonts w:ascii="宋体" w:hAnsi="宋体" w:eastAsia="宋体"/>
-                <w:b w:val="0"/>
-                <w:sz w:val="21"/>
-              </w:rPr>
-              <w:t>4. 前两个用例完成初始化与默认值；用例3～6逐步加入四个朝向的前进；用例7～10逐步加入四个朝向的左转；用例11、12分两组加入四个朝向的右转。</w:t>
-            </w:r>
-          </w:p>
-          <w:p>
-            <w:pPr>
-              <w:spacing w:after="40" w:line="252" w:lineRule="auto"/>
-              <w:jc w:val="left"/>
-            </w:pPr>
-            <w:r>
-              <w:rPr>
-                <w:rFonts w:ascii="宋体" w:hAnsi="宋体" w:eastAsia="宋体"/>
-                <w:b w:val="0"/>
-                <w:sz w:val="21"/>
-              </w:rPr>
-              <w:t>5. 用例13把单条命令处理扩展为按顺序处理整串命令；用例14处理空字符串，使状态保持不变。全部单项测试完成后，在test14分支统一运行14个用例。</w:t>
-            </w:r>
-          </w:p>
-          <w:p>
-            <w:pPr>
-              <w:spacing w:after="40" w:line="252" w:lineRule="auto"/>
-              <w:jc w:val="left"/>
-            </w:pPr>
-            <w:r>
-              <w:rPr>
-                <w:rFonts w:ascii="宋体" w:hAnsi="宋体" w:eastAsia="宋体"/>
-                <w:b w:val="0"/>
-                <w:sz w:val="21"/>
-              </w:rPr>
-              <w:t>6. 各分支已通过MinGW编译检查。测试程序的实际运行和截图按操作清单逐项完成。</w:t>
+              <w:br/>
+              <w:t>1. 保留 main 初始工程，建立 Executor 接口、Pose 状态、ExecutorImpl 实现和 GoogleTest 测试文件。使用 CMake 的 MinGW Makefiles 配置并构建 training_main。</w:t>
+              <w:br/>
+              <w:t>2. 对每个用例先提交 testN-fail 分支，再提交修正后的 testN 分支，两版均上传 GitHub。用例按初始化、四方向前进、四方向左转、右转、组合指令和空指令逐步实现。</w:t>
+              <w:br/>
+              <w:t>3. 在每个测试函数开头输出编号、输入或操作及预期状态。逐个切换分支、重新构建，只运行当前编号的测试并截取终端结果。</w:t>
+              <w:br/>
+              <w:t>4. 14 组失败版均返回测试失败，14 组修正版均返回测试通过。最后在 test14 分支运行完整测试程序，14 项全部通过。原始截图和结果记录保存在仓库 docs/screenshots。</w:t>
             </w:r>
           </w:p>
         </w:tc>
@@ -1097,466 +1015,1892 @@
             <w:gridSpan w:val="2"/>
           </w:tcPr>
           <w:p>
-            <w:pPr>
-              <w:spacing w:after="40" w:line="252" w:lineRule="auto"/>
-              <w:jc w:val="left"/>
-            </w:pPr>
-            <w:r/>
             <w:r>
               <w:rPr>
                 <w:rFonts w:ascii="宋体" w:hAnsi="宋体" w:eastAsia="宋体"/>
+                <w:sz w:val="21"/>
+              </w:rPr>
+              <w:t>八、实验数据及结果分析：</w:t>
+            </w:r>
+          </w:p>
+          <w:p>
+            <w:r>
+              <w:rPr>
+                <w:rFonts w:ascii="宋体" w:hAnsi="宋体"/>
+                <w:sz w:val="20"/>
+              </w:rPr>
+              <w:t>每组均在失败版与修正版分别构建并运行指定编号的 GoogleTest。下图为真实终端运行画面；“修改前”记录用例尚未满足时的错误结果，“修改后”记录对应代码修正后的通过结果。</w:t>
+            </w:r>
+          </w:p>
+          <w:p>
+            <w:pPr>
+              <w:keepNext/>
+              <w:spacing w:before="200"/>
+            </w:pPr>
+            <w:r>
+              <w:rPr>
+                <w:rFonts w:ascii="宋体" w:hAnsi="宋体"/>
                 <w:b/>
                 <w:sz w:val="21"/>
               </w:rPr>
-              <w:t>八、实验数据及结果分析：</w:t>
-            </w:r>
-          </w:p>
-          <w:p>
-            <w:pPr>
-              <w:spacing w:after="40" w:line="252" w:lineRule="auto"/>
-              <w:jc w:val="left"/>
-            </w:pPr>
-            <w:r>
-              <w:rPr>
-                <w:rFonts w:ascii="宋体" w:hAnsi="宋体" w:eastAsia="宋体"/>
+              <w:t>用例 01  指定初始状态 (2,-3,E)，不执行指令，期望状态不变。</w:t>
+            </w:r>
+          </w:p>
+          <w:p>
+            <w:pPr>
+              <w:keepNext/>
+            </w:pPr>
+            <w:r>
+              <w:rPr>
+                <w:rFonts w:ascii="宋体" w:hAnsi="宋体"/>
+                <w:sz w:val="20"/>
+              </w:rPr>
+              <w:t>修改内容：构造函数保存传入的初始状态。 实测：test1-fail 返回 1，测试失败；test1 返回 0，测试通过。</w:t>
+            </w:r>
+          </w:p>
+          <w:p>
+            <w:pPr>
+              <w:keepNext/>
+            </w:pPr>
+            <w:r>
+              <w:rPr>
+                <w:rFonts w:ascii="宋体" w:hAnsi="宋体"/>
+                <w:sz w:val="18"/>
+              </w:rPr>
+              <w:t>图 01-1  用例 01修改前运行结果</w:t>
+            </w:r>
+          </w:p>
+          <w:p>
+            <w:pPr>
+              <w:spacing w:after="100"/>
+              <w:jc w:val="center"/>
+            </w:pPr>
+            <w:r>
+              <w:drawing>
+                <wp:inline xmlns:a="http://schemas.openxmlformats.org/drawingml/2006/main" xmlns:pic="http://schemas.openxmlformats.org/drawingml/2006/picture">
+                  <wp:extent cx="4983480" cy="3115040"/>
+                  <wp:docPr id="1" name="Picture 1"/>
+                  <wp:cNvGraphicFramePr>
+                    <a:graphicFrameLocks noChangeAspect="1"/>
+                  </wp:cNvGraphicFramePr>
+                  <a:graphic>
+                    <a:graphicData uri="http://schemas.openxmlformats.org/drawingml/2006/picture">
+                      <pic:pic>
+                        <pic:nvPicPr>
+                          <pic:cNvPr id="0" name="case01_before.png"/>
+                          <pic:cNvPicPr/>
+                        </pic:nvPicPr>
+                        <pic:blipFill>
+                          <a:blip r:embed="rId9"/>
+                          <a:stretch>
+                            <a:fillRect/>
+                          </a:stretch>
+                        </pic:blipFill>
+                        <pic:spPr>
+                          <a:xfrm>
+                            <a:off x="0" y="0"/>
+                            <a:ext cx="4983480" cy="3115040"/>
+                          </a:xfrm>
+                          <a:prstGeom prst="rect"/>
+                        </pic:spPr>
+                      </pic:pic>
+                    </a:graphicData>
+                  </a:graphic>
+                </wp:inline>
+              </w:drawing>
+            </w:r>
+          </w:p>
+          <w:p>
+            <w:pPr>
+              <w:keepNext/>
+            </w:pPr>
+            <w:r>
+              <w:rPr>
+                <w:rFonts w:ascii="宋体" w:hAnsi="宋体"/>
+                <w:sz w:val="18"/>
+              </w:rPr>
+              <w:t>图 01-2  用例 01修改后运行结果</w:t>
+            </w:r>
+          </w:p>
+          <w:p>
+            <w:pPr>
+              <w:spacing w:after="100"/>
+              <w:jc w:val="center"/>
+            </w:pPr>
+            <w:r>
+              <w:drawing>
+                <wp:inline xmlns:a="http://schemas.openxmlformats.org/drawingml/2006/main" xmlns:pic="http://schemas.openxmlformats.org/drawingml/2006/picture">
+                  <wp:extent cx="4983480" cy="3115040"/>
+                  <wp:docPr id="2" name="Picture 2"/>
+                  <wp:cNvGraphicFramePr>
+                    <a:graphicFrameLocks noChangeAspect="1"/>
+                  </wp:cNvGraphicFramePr>
+                  <a:graphic>
+                    <a:graphicData uri="http://schemas.openxmlformats.org/drawingml/2006/picture">
+                      <pic:pic>
+                        <pic:nvPicPr>
+                          <pic:cNvPr id="0" name="case01_after.png"/>
+                          <pic:cNvPicPr/>
+                        </pic:nvPicPr>
+                        <pic:blipFill>
+                          <a:blip r:embed="rId10"/>
+                          <a:stretch>
+                            <a:fillRect/>
+                          </a:stretch>
+                        </pic:blipFill>
+                        <pic:spPr>
+                          <a:xfrm>
+                            <a:off x="0" y="0"/>
+                            <a:ext cx="4983480" cy="3115040"/>
+                          </a:xfrm>
+                          <a:prstGeom prst="rect"/>
+                        </pic:spPr>
+                      </pic:pic>
+                    </a:graphicData>
+                  </a:graphic>
+                </wp:inline>
+              </w:drawing>
+            </w:r>
+          </w:p>
+          <w:p>
+            <w:pPr>
+              <w:keepNext/>
+              <w:spacing w:before="200"/>
+            </w:pPr>
+            <w:r>
+              <w:rPr>
+                <w:rFonts w:ascii="宋体" w:hAnsi="宋体"/>
                 <w:b/>
                 <w:sz w:val="21"/>
               </w:rPr>
-              <w:t>用例、输入与预期结果：</w:t>
-            </w:r>
-          </w:p>
-          <w:p>
-            <w:pPr>
-              <w:spacing w:after="40" w:line="252" w:lineRule="auto"/>
-              <w:jc w:val="left"/>
-            </w:pPr>
-            <w:r>
-              <w:rPr>
-                <w:rFonts w:ascii="宋体" w:hAnsi="宋体" w:eastAsia="宋体"/>
-                <w:b w:val="0"/>
-                <w:sz w:val="21"/>
-              </w:rPr>
-              <w:t>用例01：指定初始状态(2,-3,E)，无指令；期望(2,-3,E)；测试名称Test01.StoresInitialPose。</w:t>
-            </w:r>
-          </w:p>
-          <w:p>
-            <w:pPr>
-              <w:spacing w:after="40" w:line="252" w:lineRule="auto"/>
-              <w:jc w:val="left"/>
-            </w:pPr>
-            <w:r>
-              <w:rPr>
-                <w:rFonts w:ascii="宋体" w:hAnsi="宋体" w:eastAsia="宋体"/>
-                <w:b w:val="0"/>
-                <w:sz w:val="21"/>
-              </w:rPr>
-              <w:t>用例02：不指定初始状态，无指令；期望(0,0,N)；测试名称Test02.UsesDefaultPose。</w:t>
-            </w:r>
-          </w:p>
-          <w:p>
-            <w:pPr>
-              <w:spacing w:after="40" w:line="252" w:lineRule="auto"/>
-              <w:jc w:val="left"/>
-            </w:pPr>
-            <w:r>
-              <w:rPr>
-                <w:rFonts w:ascii="宋体" w:hAnsi="宋体" w:eastAsia="宋体"/>
-                <w:b w:val="0"/>
-                <w:sz w:val="21"/>
-              </w:rPr>
-              <w:t>用例03：(0,0,E)执行M；期望(1,0,E)；测试名称Test03.MovesForwardFacingE。</w:t>
-            </w:r>
-          </w:p>
-          <w:p>
-            <w:pPr>
-              <w:spacing w:after="40" w:line="252" w:lineRule="auto"/>
-              <w:jc w:val="left"/>
-            </w:pPr>
-            <w:r>
-              <w:rPr>
-                <w:rFonts w:ascii="宋体" w:hAnsi="宋体" w:eastAsia="宋体"/>
-                <w:b w:val="0"/>
-                <w:sz w:val="21"/>
-              </w:rPr>
-              <w:t>用例04：(0,0,W)执行M；期望(-1,0,W)；测试名称Test04.MovesForwardFacingW。</w:t>
-            </w:r>
-          </w:p>
-          <w:p>
-            <w:pPr>
-              <w:spacing w:after="40" w:line="252" w:lineRule="auto"/>
-              <w:jc w:val="left"/>
-            </w:pPr>
-            <w:r>
-              <w:rPr>
-                <w:rFonts w:ascii="宋体" w:hAnsi="宋体" w:eastAsia="宋体"/>
-                <w:b w:val="0"/>
-                <w:sz w:val="21"/>
-              </w:rPr>
-              <w:t>用例05：(0,0,N)执行M；期望(0,1,N)；测试名称Test05.MovesForwardFacingN。</w:t>
-            </w:r>
-          </w:p>
-          <w:p>
-            <w:pPr>
-              <w:spacing w:after="40" w:line="252" w:lineRule="auto"/>
-              <w:jc w:val="left"/>
-            </w:pPr>
-            <w:r>
-              <w:rPr>
-                <w:rFonts w:ascii="宋体" w:hAnsi="宋体" w:eastAsia="宋体"/>
-                <w:b w:val="0"/>
-                <w:sz w:val="21"/>
-              </w:rPr>
-              <w:t>用例06：(0,0,S)执行M；期望(0,-1,S)；测试名称Test06.MovesForwardFacingS。</w:t>
-            </w:r>
-          </w:p>
-          <w:p>
-            <w:pPr>
-              <w:spacing w:after="40" w:line="252" w:lineRule="auto"/>
-              <w:jc w:val="left"/>
-            </w:pPr>
-            <w:r>
-              <w:rPr>
-                <w:rFonts w:ascii="宋体" w:hAnsi="宋体" w:eastAsia="宋体"/>
-                <w:b w:val="0"/>
-                <w:sz w:val="21"/>
-              </w:rPr>
-              <w:t>用例07：(3,-4,E)执行L；期望(3,-4,N)；测试名称Test07.TurnsLeftFromE。</w:t>
-            </w:r>
-          </w:p>
-          <w:p>
-            <w:pPr>
-              <w:spacing w:after="40" w:line="252" w:lineRule="auto"/>
-              <w:jc w:val="left"/>
-            </w:pPr>
-            <w:r>
-              <w:rPr>
-                <w:rFonts w:ascii="宋体" w:hAnsi="宋体" w:eastAsia="宋体"/>
-                <w:b w:val="0"/>
-                <w:sz w:val="21"/>
-              </w:rPr>
-              <w:t>用例08：(3,-4,N)执行L；期望(3,-4,W)；测试名称Test08.TurnsLeftFromN。</w:t>
-            </w:r>
-          </w:p>
-          <w:p>
-            <w:pPr>
-              <w:spacing w:after="40" w:line="252" w:lineRule="auto"/>
-              <w:jc w:val="left"/>
-            </w:pPr>
-            <w:r>
-              <w:rPr>
-                <w:rFonts w:ascii="宋体" w:hAnsi="宋体" w:eastAsia="宋体"/>
-                <w:b w:val="0"/>
-                <w:sz w:val="21"/>
-              </w:rPr>
-              <w:t>用例09：(3,-4,W)执行L；期望(3,-4,S)；测试名称Test09.TurnsLeftFromW。</w:t>
-            </w:r>
-          </w:p>
-          <w:p>
-            <w:pPr>
-              <w:spacing w:after="40" w:line="252" w:lineRule="auto"/>
-              <w:jc w:val="left"/>
-            </w:pPr>
-            <w:r>
-              <w:rPr>
-                <w:rFonts w:ascii="宋体" w:hAnsi="宋体" w:eastAsia="宋体"/>
-                <w:b w:val="0"/>
-                <w:sz w:val="21"/>
-              </w:rPr>
-              <w:t>用例10：(3,-4,S)执行L；期望(3,-4,E)；测试名称Test10.TurnsLeftFromS。</w:t>
-            </w:r>
-          </w:p>
-          <w:p>
-            <w:pPr>
-              <w:spacing w:after="40" w:line="252" w:lineRule="auto"/>
-              <w:jc w:val="left"/>
-            </w:pPr>
-            <w:r>
-              <w:rPr>
-                <w:rFonts w:ascii="宋体" w:hAnsi="宋体" w:eastAsia="宋体"/>
-                <w:b w:val="0"/>
-                <w:sz w:val="21"/>
-              </w:rPr>
-              <w:t>用例11：E、S朝向分别执行R；期望E→S，S→W，坐标不变；测试名称Test11.TurnsRightPair1。</w:t>
-            </w:r>
-          </w:p>
-          <w:p>
-            <w:pPr>
-              <w:spacing w:after="40" w:line="252" w:lineRule="auto"/>
-              <w:jc w:val="left"/>
-            </w:pPr>
-            <w:r>
-              <w:rPr>
-                <w:rFonts w:ascii="宋体" w:hAnsi="宋体" w:eastAsia="宋体"/>
-                <w:b w:val="0"/>
-                <w:sz w:val="21"/>
-              </w:rPr>
-              <w:t>用例12：W、N朝向分别执行R；期望W→N，N→E，坐标不变；测试名称Test12.TurnsRightPair2。</w:t>
-            </w:r>
-          </w:p>
-          <w:p>
-            <w:pPr>
-              <w:spacing w:after="40" w:line="252" w:lineRule="auto"/>
-              <w:jc w:val="left"/>
-            </w:pPr>
-            <w:r>
-              <w:rPr>
-                <w:rFonts w:ascii="宋体" w:hAnsi="宋体" w:eastAsia="宋体"/>
-                <w:b w:val="0"/>
-                <w:sz w:val="21"/>
-              </w:rPr>
-              <w:t>用例13：默认状态执行MLMMRM；期望(-2,2,N)；测试名称Test13.ExecutesMixedCommandsInOrder。</w:t>
-            </w:r>
-          </w:p>
-          <w:p>
-            <w:pPr>
-              <w:spacing w:after="40" w:line="252" w:lineRule="auto"/>
-              <w:jc w:val="left"/>
-            </w:pPr>
-            <w:r>
-              <w:rPr>
-                <w:rFonts w:ascii="宋体" w:hAnsi="宋体" w:eastAsia="宋体"/>
-                <w:b w:val="0"/>
-                <w:sz w:val="21"/>
-              </w:rPr>
-              <w:t>用例14：(3,-4,S)执行空指令；期望(3,-4,S)；测试名称Test14.EmptyCommandKeepsPose。</w:t>
-            </w:r>
-          </w:p>
-          <w:p>
-            <w:pPr>
-              <w:spacing w:after="40" w:line="252" w:lineRule="auto"/>
-              <w:jc w:val="left"/>
-            </w:pPr>
-            <w:r>
-              <w:rPr>
-                <w:rFonts w:ascii="宋体" w:hAnsi="宋体" w:eastAsia="宋体"/>
+              <w:t>用例 02  不提供初始状态，期望 (0,0,N)。</w:t>
+            </w:r>
+          </w:p>
+          <w:p>
+            <w:pPr>
+              <w:keepNext/>
+            </w:pPr>
+            <w:r>
+              <w:rPr>
+                <w:rFonts w:ascii="宋体" w:hAnsi="宋体"/>
+                <w:sz w:val="20"/>
+              </w:rPr>
+              <w:t>修改内容：将默认朝向从 E 改为 N。 实测：test2-fail 返回 1，测试失败；test2 返回 0，测试通过。</w:t>
+            </w:r>
+          </w:p>
+          <w:p>
+            <w:pPr>
+              <w:keepNext/>
+            </w:pPr>
+            <w:r>
+              <w:rPr>
+                <w:rFonts w:ascii="宋体" w:hAnsi="宋体"/>
+                <w:sz w:val="18"/>
+              </w:rPr>
+              <w:t>图 02-1  用例 02修改前运行结果</w:t>
+            </w:r>
+          </w:p>
+          <w:p>
+            <w:pPr>
+              <w:spacing w:after="100"/>
+              <w:jc w:val="center"/>
+            </w:pPr>
+            <w:r>
+              <w:drawing>
+                <wp:inline xmlns:a="http://schemas.openxmlformats.org/drawingml/2006/main" xmlns:pic="http://schemas.openxmlformats.org/drawingml/2006/picture">
+                  <wp:extent cx="4983480" cy="3115040"/>
+                  <wp:docPr id="3" name="Picture 3"/>
+                  <wp:cNvGraphicFramePr>
+                    <a:graphicFrameLocks noChangeAspect="1"/>
+                  </wp:cNvGraphicFramePr>
+                  <a:graphic>
+                    <a:graphicData uri="http://schemas.openxmlformats.org/drawingml/2006/picture">
+                      <pic:pic>
+                        <pic:nvPicPr>
+                          <pic:cNvPr id="0" name="case02_before.png"/>
+                          <pic:cNvPicPr/>
+                        </pic:nvPicPr>
+                        <pic:blipFill>
+                          <a:blip r:embed="rId11"/>
+                          <a:stretch>
+                            <a:fillRect/>
+                          </a:stretch>
+                        </pic:blipFill>
+                        <pic:spPr>
+                          <a:xfrm>
+                            <a:off x="0" y="0"/>
+                            <a:ext cx="4983480" cy="3115040"/>
+                          </a:xfrm>
+                          <a:prstGeom prst="rect"/>
+                        </pic:spPr>
+                      </pic:pic>
+                    </a:graphicData>
+                  </a:graphic>
+                </wp:inline>
+              </w:drawing>
+            </w:r>
+          </w:p>
+          <w:p>
+            <w:pPr>
+              <w:keepNext/>
+            </w:pPr>
+            <w:r>
+              <w:rPr>
+                <w:rFonts w:ascii="宋体" w:hAnsi="宋体"/>
+                <w:sz w:val="18"/>
+              </w:rPr>
+              <w:t>图 02-2  用例 02修改后运行结果</w:t>
+            </w:r>
+          </w:p>
+          <w:p>
+            <w:pPr>
+              <w:spacing w:after="100"/>
+              <w:jc w:val="center"/>
+            </w:pPr>
+            <w:r>
+              <w:drawing>
+                <wp:inline xmlns:a="http://schemas.openxmlformats.org/drawingml/2006/main" xmlns:pic="http://schemas.openxmlformats.org/drawingml/2006/picture">
+                  <wp:extent cx="4983480" cy="3115040"/>
+                  <wp:docPr id="4" name="Picture 4"/>
+                  <wp:cNvGraphicFramePr>
+                    <a:graphicFrameLocks noChangeAspect="1"/>
+                  </wp:cNvGraphicFramePr>
+                  <a:graphic>
+                    <a:graphicData uri="http://schemas.openxmlformats.org/drawingml/2006/picture">
+                      <pic:pic>
+                        <pic:nvPicPr>
+                          <pic:cNvPr id="0" name="case02_after.png"/>
+                          <pic:cNvPicPr/>
+                        </pic:nvPicPr>
+                        <pic:blipFill>
+                          <a:blip r:embed="rId12"/>
+                          <a:stretch>
+                            <a:fillRect/>
+                          </a:stretch>
+                        </pic:blipFill>
+                        <pic:spPr>
+                          <a:xfrm>
+                            <a:off x="0" y="0"/>
+                            <a:ext cx="4983480" cy="3115040"/>
+                          </a:xfrm>
+                          <a:prstGeom prst="rect"/>
+                        </pic:spPr>
+                      </pic:pic>
+                    </a:graphicData>
+                  </a:graphic>
+                </wp:inline>
+              </w:drawing>
+            </w:r>
+          </w:p>
+          <w:p>
+            <w:pPr>
+              <w:keepNext/>
+              <w:spacing w:before="200"/>
+            </w:pPr>
+            <w:r>
+              <w:rPr>
+                <w:rFonts w:ascii="宋体" w:hAnsi="宋体"/>
                 <w:b/>
                 <w:sz w:val="21"/>
               </w:rPr>
-              <w:t>结果记录：</w:t>
-            </w:r>
-          </w:p>
-          <w:p>
-            <w:pPr>
-              <w:spacing w:after="40" w:line="252" w:lineRule="auto"/>
-              <w:jc w:val="left"/>
-            </w:pPr>
-            <w:r>
-              <w:rPr>
-                <w:rFonts w:ascii="宋体" w:hAnsi="宋体" w:eastAsia="宋体"/>
-                <w:b w:val="0"/>
+              <w:t>用例 03  朝东执行 M，期望 x 从 0 增至 1。</w:t>
+            </w:r>
+          </w:p>
+          <w:p>
+            <w:pPr>
+              <w:keepNext/>
+            </w:pPr>
+            <w:r>
+              <w:rPr>
+                <w:rFonts w:ascii="宋体" w:hAnsi="宋体"/>
+                <w:sz w:val="20"/>
+              </w:rPr>
+              <w:t>修改内容：增加朝东前进分支。 实测：test3-fail 返回 1，测试失败；test3 返回 0，测试通过。</w:t>
+            </w:r>
+          </w:p>
+          <w:p>
+            <w:pPr>
+              <w:keepNext/>
+            </w:pPr>
+            <w:r>
+              <w:rPr>
+                <w:rFonts w:ascii="宋体" w:hAnsi="宋体"/>
+                <w:sz w:val="18"/>
+              </w:rPr>
+              <w:t>图 03-1  用例 03修改前运行结果</w:t>
+            </w:r>
+          </w:p>
+          <w:p>
+            <w:pPr>
+              <w:spacing w:after="100"/>
+              <w:jc w:val="center"/>
+            </w:pPr>
+            <w:r>
+              <w:drawing>
+                <wp:inline xmlns:a="http://schemas.openxmlformats.org/drawingml/2006/main" xmlns:pic="http://schemas.openxmlformats.org/drawingml/2006/picture">
+                  <wp:extent cx="4983480" cy="3115040"/>
+                  <wp:docPr id="5" name="Picture 5"/>
+                  <wp:cNvGraphicFramePr>
+                    <a:graphicFrameLocks noChangeAspect="1"/>
+                  </wp:cNvGraphicFramePr>
+                  <a:graphic>
+                    <a:graphicData uri="http://schemas.openxmlformats.org/drawingml/2006/picture">
+                      <pic:pic>
+                        <pic:nvPicPr>
+                          <pic:cNvPr id="0" name="case03_before.png"/>
+                          <pic:cNvPicPr/>
+                        </pic:nvPicPr>
+                        <pic:blipFill>
+                          <a:blip r:embed="rId13"/>
+                          <a:stretch>
+                            <a:fillRect/>
+                          </a:stretch>
+                        </pic:blipFill>
+                        <pic:spPr>
+                          <a:xfrm>
+                            <a:off x="0" y="0"/>
+                            <a:ext cx="4983480" cy="3115040"/>
+                          </a:xfrm>
+                          <a:prstGeom prst="rect"/>
+                        </pic:spPr>
+                      </pic:pic>
+                    </a:graphicData>
+                  </a:graphic>
+                </wp:inline>
+              </w:drawing>
+            </w:r>
+          </w:p>
+          <w:p>
+            <w:pPr>
+              <w:keepNext/>
+            </w:pPr>
+            <w:r>
+              <w:rPr>
+                <w:rFonts w:ascii="宋体" w:hAnsi="宋体"/>
+                <w:sz w:val="18"/>
+              </w:rPr>
+              <w:t>图 03-2  用例 03修改后运行结果</w:t>
+            </w:r>
+          </w:p>
+          <w:p>
+            <w:pPr>
+              <w:spacing w:after="100"/>
+              <w:jc w:val="center"/>
+            </w:pPr>
+            <w:r>
+              <w:drawing>
+                <wp:inline xmlns:a="http://schemas.openxmlformats.org/drawingml/2006/main" xmlns:pic="http://schemas.openxmlformats.org/drawingml/2006/picture">
+                  <wp:extent cx="4983480" cy="3115040"/>
+                  <wp:docPr id="6" name="Picture 6"/>
+                  <wp:cNvGraphicFramePr>
+                    <a:graphicFrameLocks noChangeAspect="1"/>
+                  </wp:cNvGraphicFramePr>
+                  <a:graphic>
+                    <a:graphicData uri="http://schemas.openxmlformats.org/drawingml/2006/picture">
+                      <pic:pic>
+                        <pic:nvPicPr>
+                          <pic:cNvPr id="0" name="case03_after.png"/>
+                          <pic:cNvPicPr/>
+                        </pic:nvPicPr>
+                        <pic:blipFill>
+                          <a:blip r:embed="rId14"/>
+                          <a:stretch>
+                            <a:fillRect/>
+                          </a:stretch>
+                        </pic:blipFill>
+                        <pic:spPr>
+                          <a:xfrm>
+                            <a:off x="0" y="0"/>
+                            <a:ext cx="4983480" cy="3115040"/>
+                          </a:xfrm>
+                          <a:prstGeom prst="rect"/>
+                        </pic:spPr>
+                      </pic:pic>
+                    </a:graphicData>
+                  </a:graphic>
+                </wp:inline>
+              </w:drawing>
+            </w:r>
+          </w:p>
+          <w:p>
+            <w:pPr>
+              <w:keepNext/>
+              <w:spacing w:before="200"/>
+            </w:pPr>
+            <w:r>
+              <w:rPr>
+                <w:rFonts w:ascii="宋体" w:hAnsi="宋体"/>
+                <w:b/>
                 <w:sz w:val="21"/>
               </w:rPr>
-              <w:t>每个用例的testN-fail分支预期出现该编号测试失败；testN分支预期出现该编号测试通过。失败原因与修改内容以实际运行输出和对应提交差异为依据。</w:t>
-            </w:r>
-          </w:p>
-          <w:p>
-            <w:pPr>
-              <w:spacing w:after="40" w:line="252" w:lineRule="auto"/>
-              <w:jc w:val="left"/>
-            </w:pPr>
-            <w:r>
-              <w:rPr>
-                <w:rFonts w:ascii="宋体" w:hAnsi="宋体" w:eastAsia="宋体"/>
-                <w:b w:val="0"/>
+              <w:t>用例 04  朝西执行 M，期望 x 从 0 减至 -1。</w:t>
+            </w:r>
+          </w:p>
+          <w:p>
+            <w:pPr>
+              <w:keepNext/>
+            </w:pPr>
+            <w:r>
+              <w:rPr>
+                <w:rFonts w:ascii="宋体" w:hAnsi="宋体"/>
+                <w:sz w:val="20"/>
+              </w:rPr>
+              <w:t>修改内容：增加朝西前进分支。 实测：test4-fail 返回 1，测试失败；test4 返回 0，测试通过。</w:t>
+            </w:r>
+          </w:p>
+          <w:p>
+            <w:pPr>
+              <w:keepNext/>
+            </w:pPr>
+            <w:r>
+              <w:rPr>
+                <w:rFonts w:ascii="宋体" w:hAnsi="宋体"/>
+                <w:sz w:val="18"/>
+              </w:rPr>
+              <w:t>图 04-1  用例 04修改前运行结果</w:t>
+            </w:r>
+          </w:p>
+          <w:p>
+            <w:pPr>
+              <w:spacing w:after="100"/>
+              <w:jc w:val="center"/>
+            </w:pPr>
+            <w:r>
+              <w:drawing>
+                <wp:inline xmlns:a="http://schemas.openxmlformats.org/drawingml/2006/main" xmlns:pic="http://schemas.openxmlformats.org/drawingml/2006/picture">
+                  <wp:extent cx="4983480" cy="3115040"/>
+                  <wp:docPr id="7" name="Picture 7"/>
+                  <wp:cNvGraphicFramePr>
+                    <a:graphicFrameLocks noChangeAspect="1"/>
+                  </wp:cNvGraphicFramePr>
+                  <a:graphic>
+                    <a:graphicData uri="http://schemas.openxmlformats.org/drawingml/2006/picture">
+                      <pic:pic>
+                        <pic:nvPicPr>
+                          <pic:cNvPr id="0" name="case04_before.png"/>
+                          <pic:cNvPicPr/>
+                        </pic:nvPicPr>
+                        <pic:blipFill>
+                          <a:blip r:embed="rId15"/>
+                          <a:stretch>
+                            <a:fillRect/>
+                          </a:stretch>
+                        </pic:blipFill>
+                        <pic:spPr>
+                          <a:xfrm>
+                            <a:off x="0" y="0"/>
+                            <a:ext cx="4983480" cy="3115040"/>
+                          </a:xfrm>
+                          <a:prstGeom prst="rect"/>
+                        </pic:spPr>
+                      </pic:pic>
+                    </a:graphicData>
+                  </a:graphic>
+                </wp:inline>
+              </w:drawing>
+            </w:r>
+          </w:p>
+          <w:p>
+            <w:pPr>
+              <w:keepNext/>
+            </w:pPr>
+            <w:r>
+              <w:rPr>
+                <w:rFonts w:ascii="宋体" w:hAnsi="宋体"/>
+                <w:sz w:val="18"/>
+              </w:rPr>
+              <w:t>图 04-2  用例 04修改后运行结果</w:t>
+            </w:r>
+          </w:p>
+          <w:p>
+            <w:pPr>
+              <w:spacing w:after="100"/>
+              <w:jc w:val="center"/>
+            </w:pPr>
+            <w:r>
+              <w:drawing>
+                <wp:inline xmlns:a="http://schemas.openxmlformats.org/drawingml/2006/main" xmlns:pic="http://schemas.openxmlformats.org/drawingml/2006/picture">
+                  <wp:extent cx="4983480" cy="3115040"/>
+                  <wp:docPr id="8" name="Picture 8"/>
+                  <wp:cNvGraphicFramePr>
+                    <a:graphicFrameLocks noChangeAspect="1"/>
+                  </wp:cNvGraphicFramePr>
+                  <a:graphic>
+                    <a:graphicData uri="http://schemas.openxmlformats.org/drawingml/2006/picture">
+                      <pic:pic>
+                        <pic:nvPicPr>
+                          <pic:cNvPr id="0" name="case04_after.png"/>
+                          <pic:cNvPicPr/>
+                        </pic:nvPicPr>
+                        <pic:blipFill>
+                          <a:blip r:embed="rId16"/>
+                          <a:stretch>
+                            <a:fillRect/>
+                          </a:stretch>
+                        </pic:blipFill>
+                        <pic:spPr>
+                          <a:xfrm>
+                            <a:off x="0" y="0"/>
+                            <a:ext cx="4983480" cy="3115040"/>
+                          </a:xfrm>
+                          <a:prstGeom prst="rect"/>
+                        </pic:spPr>
+                      </pic:pic>
+                    </a:graphicData>
+                  </a:graphic>
+                </wp:inline>
+              </w:drawing>
+            </w:r>
+          </w:p>
+          <w:p>
+            <w:pPr>
+              <w:keepNext/>
+              <w:spacing w:before="200"/>
+            </w:pPr>
+            <w:r>
+              <w:rPr>
+                <w:rFonts w:ascii="宋体" w:hAnsi="宋体"/>
+                <w:b/>
                 <w:sz w:val="21"/>
               </w:rPr>
-              <w:t>用例01：失败版结果________；通过版结果________；两张运行截图待插入。</w:t>
-            </w:r>
-          </w:p>
-          <w:p>
-            <w:pPr>
-              <w:spacing w:after="40" w:line="252" w:lineRule="auto"/>
-              <w:jc w:val="left"/>
-            </w:pPr>
-            <w:r>
-              <w:rPr>
-                <w:rFonts w:ascii="宋体" w:hAnsi="宋体" w:eastAsia="宋体"/>
-                <w:b w:val="0"/>
+              <w:t>用例 05  朝北执行 M，期望 y 从 0 增至 1。</w:t>
+            </w:r>
+          </w:p>
+          <w:p>
+            <w:pPr>
+              <w:keepNext/>
+            </w:pPr>
+            <w:r>
+              <w:rPr>
+                <w:rFonts w:ascii="宋体" w:hAnsi="宋体"/>
+                <w:sz w:val="20"/>
+              </w:rPr>
+              <w:t>修改内容：增加朝北前进分支。 实测：test5-fail 返回 1，测试失败；test5 返回 0，测试通过。</w:t>
+            </w:r>
+          </w:p>
+          <w:p>
+            <w:pPr>
+              <w:keepNext/>
+            </w:pPr>
+            <w:r>
+              <w:rPr>
+                <w:rFonts w:ascii="宋体" w:hAnsi="宋体"/>
+                <w:sz w:val="18"/>
+              </w:rPr>
+              <w:t>图 05-1  用例 05修改前运行结果</w:t>
+            </w:r>
+          </w:p>
+          <w:p>
+            <w:pPr>
+              <w:spacing w:after="100"/>
+              <w:jc w:val="center"/>
+            </w:pPr>
+            <w:r>
+              <w:drawing>
+                <wp:inline xmlns:a="http://schemas.openxmlformats.org/drawingml/2006/main" xmlns:pic="http://schemas.openxmlformats.org/drawingml/2006/picture">
+                  <wp:extent cx="4983480" cy="3115040"/>
+                  <wp:docPr id="9" name="Picture 9"/>
+                  <wp:cNvGraphicFramePr>
+                    <a:graphicFrameLocks noChangeAspect="1"/>
+                  </wp:cNvGraphicFramePr>
+                  <a:graphic>
+                    <a:graphicData uri="http://schemas.openxmlformats.org/drawingml/2006/picture">
+                      <pic:pic>
+                        <pic:nvPicPr>
+                          <pic:cNvPr id="0" name="case05_before.png"/>
+                          <pic:cNvPicPr/>
+                        </pic:nvPicPr>
+                        <pic:blipFill>
+                          <a:blip r:embed="rId17"/>
+                          <a:stretch>
+                            <a:fillRect/>
+                          </a:stretch>
+                        </pic:blipFill>
+                        <pic:spPr>
+                          <a:xfrm>
+                            <a:off x="0" y="0"/>
+                            <a:ext cx="4983480" cy="3115040"/>
+                          </a:xfrm>
+                          <a:prstGeom prst="rect"/>
+                        </pic:spPr>
+                      </pic:pic>
+                    </a:graphicData>
+                  </a:graphic>
+                </wp:inline>
+              </w:drawing>
+            </w:r>
+          </w:p>
+          <w:p>
+            <w:pPr>
+              <w:keepNext/>
+            </w:pPr>
+            <w:r>
+              <w:rPr>
+                <w:rFonts w:ascii="宋体" w:hAnsi="宋体"/>
+                <w:sz w:val="18"/>
+              </w:rPr>
+              <w:t>图 05-2  用例 05修改后运行结果</w:t>
+            </w:r>
+          </w:p>
+          <w:p>
+            <w:pPr>
+              <w:spacing w:after="100"/>
+              <w:jc w:val="center"/>
+            </w:pPr>
+            <w:r>
+              <w:drawing>
+                <wp:inline xmlns:a="http://schemas.openxmlformats.org/drawingml/2006/main" xmlns:pic="http://schemas.openxmlformats.org/drawingml/2006/picture">
+                  <wp:extent cx="4983480" cy="3115040"/>
+                  <wp:docPr id="10" name="Picture 10"/>
+                  <wp:cNvGraphicFramePr>
+                    <a:graphicFrameLocks noChangeAspect="1"/>
+                  </wp:cNvGraphicFramePr>
+                  <a:graphic>
+                    <a:graphicData uri="http://schemas.openxmlformats.org/drawingml/2006/picture">
+                      <pic:pic>
+                        <pic:nvPicPr>
+                          <pic:cNvPr id="0" name="case05_after.png"/>
+                          <pic:cNvPicPr/>
+                        </pic:nvPicPr>
+                        <pic:blipFill>
+                          <a:blip r:embed="rId18"/>
+                          <a:stretch>
+                            <a:fillRect/>
+                          </a:stretch>
+                        </pic:blipFill>
+                        <pic:spPr>
+                          <a:xfrm>
+                            <a:off x="0" y="0"/>
+                            <a:ext cx="4983480" cy="3115040"/>
+                          </a:xfrm>
+                          <a:prstGeom prst="rect"/>
+                        </pic:spPr>
+                      </pic:pic>
+                    </a:graphicData>
+                  </a:graphic>
+                </wp:inline>
+              </w:drawing>
+            </w:r>
+          </w:p>
+          <w:p>
+            <w:pPr>
+              <w:keepNext/>
+              <w:spacing w:before="200"/>
+            </w:pPr>
+            <w:r>
+              <w:rPr>
+                <w:rFonts w:ascii="宋体" w:hAnsi="宋体"/>
+                <w:b/>
                 <w:sz w:val="21"/>
               </w:rPr>
-              <w:t>用例02：失败版结果________；通过版结果________；两张运行截图待插入。</w:t>
-            </w:r>
-          </w:p>
-          <w:p>
-            <w:pPr>
-              <w:spacing w:after="40" w:line="252" w:lineRule="auto"/>
-              <w:jc w:val="left"/>
-            </w:pPr>
-            <w:r>
-              <w:rPr>
-                <w:rFonts w:ascii="宋体" w:hAnsi="宋体" w:eastAsia="宋体"/>
-                <w:b w:val="0"/>
+              <w:t>用例 06  朝南执行 M，期望 y 从 0 减至 -1。</w:t>
+            </w:r>
+          </w:p>
+          <w:p>
+            <w:pPr>
+              <w:keepNext/>
+            </w:pPr>
+            <w:r>
+              <w:rPr>
+                <w:rFonts w:ascii="宋体" w:hAnsi="宋体"/>
+                <w:sz w:val="20"/>
+              </w:rPr>
+              <w:t>修改内容：增加朝南前进分支。 实测：test6-fail 返回 1，测试失败；test6 返回 0，测试通过。</w:t>
+            </w:r>
+          </w:p>
+          <w:p>
+            <w:pPr>
+              <w:keepNext/>
+            </w:pPr>
+            <w:r>
+              <w:rPr>
+                <w:rFonts w:ascii="宋体" w:hAnsi="宋体"/>
+                <w:sz w:val="18"/>
+              </w:rPr>
+              <w:t>图 06-1  用例 06修改前运行结果</w:t>
+            </w:r>
+          </w:p>
+          <w:p>
+            <w:pPr>
+              <w:spacing w:after="100"/>
+              <w:jc w:val="center"/>
+            </w:pPr>
+            <w:r>
+              <w:drawing>
+                <wp:inline xmlns:a="http://schemas.openxmlformats.org/drawingml/2006/main" xmlns:pic="http://schemas.openxmlformats.org/drawingml/2006/picture">
+                  <wp:extent cx="4983480" cy="3115040"/>
+                  <wp:docPr id="11" name="Picture 11"/>
+                  <wp:cNvGraphicFramePr>
+                    <a:graphicFrameLocks noChangeAspect="1"/>
+                  </wp:cNvGraphicFramePr>
+                  <a:graphic>
+                    <a:graphicData uri="http://schemas.openxmlformats.org/drawingml/2006/picture">
+                      <pic:pic>
+                        <pic:nvPicPr>
+                          <pic:cNvPr id="0" name="case06_before.png"/>
+                          <pic:cNvPicPr/>
+                        </pic:nvPicPr>
+                        <pic:blipFill>
+                          <a:blip r:embed="rId19"/>
+                          <a:stretch>
+                            <a:fillRect/>
+                          </a:stretch>
+                        </pic:blipFill>
+                        <pic:spPr>
+                          <a:xfrm>
+                            <a:off x="0" y="0"/>
+                            <a:ext cx="4983480" cy="3115040"/>
+                          </a:xfrm>
+                          <a:prstGeom prst="rect"/>
+                        </pic:spPr>
+                      </pic:pic>
+                    </a:graphicData>
+                  </a:graphic>
+                </wp:inline>
+              </w:drawing>
+            </w:r>
+          </w:p>
+          <w:p>
+            <w:pPr>
+              <w:keepNext/>
+            </w:pPr>
+            <w:r>
+              <w:rPr>
+                <w:rFonts w:ascii="宋体" w:hAnsi="宋体"/>
+                <w:sz w:val="18"/>
+              </w:rPr>
+              <w:t>图 06-2  用例 06修改后运行结果</w:t>
+            </w:r>
+          </w:p>
+          <w:p>
+            <w:pPr>
+              <w:spacing w:after="100"/>
+              <w:jc w:val="center"/>
+            </w:pPr>
+            <w:r>
+              <w:drawing>
+                <wp:inline xmlns:a="http://schemas.openxmlformats.org/drawingml/2006/main" xmlns:pic="http://schemas.openxmlformats.org/drawingml/2006/picture">
+                  <wp:extent cx="4983480" cy="3115040"/>
+                  <wp:docPr id="12" name="Picture 12"/>
+                  <wp:cNvGraphicFramePr>
+                    <a:graphicFrameLocks noChangeAspect="1"/>
+                  </wp:cNvGraphicFramePr>
+                  <a:graphic>
+                    <a:graphicData uri="http://schemas.openxmlformats.org/drawingml/2006/picture">
+                      <pic:pic>
+                        <pic:nvPicPr>
+                          <pic:cNvPr id="0" name="case06_after.png"/>
+                          <pic:cNvPicPr/>
+                        </pic:nvPicPr>
+                        <pic:blipFill>
+                          <a:blip r:embed="rId20"/>
+                          <a:stretch>
+                            <a:fillRect/>
+                          </a:stretch>
+                        </pic:blipFill>
+                        <pic:spPr>
+                          <a:xfrm>
+                            <a:off x="0" y="0"/>
+                            <a:ext cx="4983480" cy="3115040"/>
+                          </a:xfrm>
+                          <a:prstGeom prst="rect"/>
+                        </pic:spPr>
+                      </pic:pic>
+                    </a:graphicData>
+                  </a:graphic>
+                </wp:inline>
+              </w:drawing>
+            </w:r>
+          </w:p>
+          <w:p>
+            <w:pPr>
+              <w:keepNext/>
+              <w:spacing w:before="200"/>
+            </w:pPr>
+            <w:r>
+              <w:rPr>
+                <w:rFonts w:ascii="宋体" w:hAnsi="宋体"/>
+                <w:b/>
                 <w:sz w:val="21"/>
               </w:rPr>
-              <w:t>用例03：失败版结果________；通过版结果________；两张运行截图待插入。</w:t>
-            </w:r>
-          </w:p>
-          <w:p>
-            <w:pPr>
-              <w:spacing w:after="40" w:line="252" w:lineRule="auto"/>
-              <w:jc w:val="left"/>
-            </w:pPr>
-            <w:r>
-              <w:rPr>
-                <w:rFonts w:ascii="宋体" w:hAnsi="宋体" w:eastAsia="宋体"/>
-                <w:b w:val="0"/>
+              <w:t>用例 07  朝东执行 L，期望原地转为北。</w:t>
+            </w:r>
+          </w:p>
+          <w:p>
+            <w:pPr>
+              <w:keepNext/>
+            </w:pPr>
+            <w:r>
+              <w:rPr>
+                <w:rFonts w:ascii="宋体" w:hAnsi="宋体"/>
+                <w:sz w:val="20"/>
+              </w:rPr>
+              <w:t>修改内容：增加左转处理及 E 到 N 的转换。 实测：test7-fail 返回 1，测试失败；test7 返回 0，测试通过。</w:t>
+            </w:r>
+          </w:p>
+          <w:p>
+            <w:pPr>
+              <w:keepNext/>
+            </w:pPr>
+            <w:r>
+              <w:rPr>
+                <w:rFonts w:ascii="宋体" w:hAnsi="宋体"/>
+                <w:sz w:val="18"/>
+              </w:rPr>
+              <w:t>图 07-1  用例 07修改前运行结果</w:t>
+            </w:r>
+          </w:p>
+          <w:p>
+            <w:pPr>
+              <w:spacing w:after="100"/>
+              <w:jc w:val="center"/>
+            </w:pPr>
+            <w:r>
+              <w:drawing>
+                <wp:inline xmlns:a="http://schemas.openxmlformats.org/drawingml/2006/main" xmlns:pic="http://schemas.openxmlformats.org/drawingml/2006/picture">
+                  <wp:extent cx="4983480" cy="3115040"/>
+                  <wp:docPr id="13" name="Picture 13"/>
+                  <wp:cNvGraphicFramePr>
+                    <a:graphicFrameLocks noChangeAspect="1"/>
+                  </wp:cNvGraphicFramePr>
+                  <a:graphic>
+                    <a:graphicData uri="http://schemas.openxmlformats.org/drawingml/2006/picture">
+                      <pic:pic>
+                        <pic:nvPicPr>
+                          <pic:cNvPr id="0" name="case07_before.png"/>
+                          <pic:cNvPicPr/>
+                        </pic:nvPicPr>
+                        <pic:blipFill>
+                          <a:blip r:embed="rId21"/>
+                          <a:stretch>
+                            <a:fillRect/>
+                          </a:stretch>
+                        </pic:blipFill>
+                        <pic:spPr>
+                          <a:xfrm>
+                            <a:off x="0" y="0"/>
+                            <a:ext cx="4983480" cy="3115040"/>
+                          </a:xfrm>
+                          <a:prstGeom prst="rect"/>
+                        </pic:spPr>
+                      </pic:pic>
+                    </a:graphicData>
+                  </a:graphic>
+                </wp:inline>
+              </w:drawing>
+            </w:r>
+          </w:p>
+          <w:p>
+            <w:pPr>
+              <w:keepNext/>
+            </w:pPr>
+            <w:r>
+              <w:rPr>
+                <w:rFonts w:ascii="宋体" w:hAnsi="宋体"/>
+                <w:sz w:val="18"/>
+              </w:rPr>
+              <w:t>图 07-2  用例 07修改后运行结果</w:t>
+            </w:r>
+          </w:p>
+          <w:p>
+            <w:pPr>
+              <w:spacing w:after="100"/>
+              <w:jc w:val="center"/>
+            </w:pPr>
+            <w:r>
+              <w:drawing>
+                <wp:inline xmlns:a="http://schemas.openxmlformats.org/drawingml/2006/main" xmlns:pic="http://schemas.openxmlformats.org/drawingml/2006/picture">
+                  <wp:extent cx="4983480" cy="3115040"/>
+                  <wp:docPr id="14" name="Picture 14"/>
+                  <wp:cNvGraphicFramePr>
+                    <a:graphicFrameLocks noChangeAspect="1"/>
+                  </wp:cNvGraphicFramePr>
+                  <a:graphic>
+                    <a:graphicData uri="http://schemas.openxmlformats.org/drawingml/2006/picture">
+                      <pic:pic>
+                        <pic:nvPicPr>
+                          <pic:cNvPr id="0" name="case07_after.png"/>
+                          <pic:cNvPicPr/>
+                        </pic:nvPicPr>
+                        <pic:blipFill>
+                          <a:blip r:embed="rId22"/>
+                          <a:stretch>
+                            <a:fillRect/>
+                          </a:stretch>
+                        </pic:blipFill>
+                        <pic:spPr>
+                          <a:xfrm>
+                            <a:off x="0" y="0"/>
+                            <a:ext cx="4983480" cy="3115040"/>
+                          </a:xfrm>
+                          <a:prstGeom prst="rect"/>
+                        </pic:spPr>
+                      </pic:pic>
+                    </a:graphicData>
+                  </a:graphic>
+                </wp:inline>
+              </w:drawing>
+            </w:r>
+          </w:p>
+          <w:p>
+            <w:pPr>
+              <w:keepNext/>
+              <w:spacing w:before="200"/>
+            </w:pPr>
+            <w:r>
+              <w:rPr>
+                <w:rFonts w:ascii="宋体" w:hAnsi="宋体"/>
+                <w:b/>
                 <w:sz w:val="21"/>
               </w:rPr>
-              <w:t>用例04：失败版结果________；通过版结果________；两张运行截图待插入。</w:t>
-            </w:r>
-          </w:p>
-          <w:p>
-            <w:pPr>
-              <w:spacing w:after="40" w:line="252" w:lineRule="auto"/>
-              <w:jc w:val="left"/>
-            </w:pPr>
-            <w:r>
-              <w:rPr>
-                <w:rFonts w:ascii="宋体" w:hAnsi="宋体" w:eastAsia="宋体"/>
-                <w:b w:val="0"/>
+              <w:t>用例 08  朝北执行 L，期望原地转为西。</w:t>
+            </w:r>
+          </w:p>
+          <w:p>
+            <w:pPr>
+              <w:keepNext/>
+            </w:pPr>
+            <w:r>
+              <w:rPr>
+                <w:rFonts w:ascii="宋体" w:hAnsi="宋体"/>
+                <w:sz w:val="20"/>
+              </w:rPr>
+              <w:t>修改内容：增加 N 到 W 的左转转换。 实测：test8-fail 返回 1，测试失败；test8 返回 0，测试通过。</w:t>
+            </w:r>
+          </w:p>
+          <w:p>
+            <w:pPr>
+              <w:keepNext/>
+            </w:pPr>
+            <w:r>
+              <w:rPr>
+                <w:rFonts w:ascii="宋体" w:hAnsi="宋体"/>
+                <w:sz w:val="18"/>
+              </w:rPr>
+              <w:t>图 08-1  用例 08修改前运行结果</w:t>
+            </w:r>
+          </w:p>
+          <w:p>
+            <w:pPr>
+              <w:spacing w:after="100"/>
+              <w:jc w:val="center"/>
+            </w:pPr>
+            <w:r>
+              <w:drawing>
+                <wp:inline xmlns:a="http://schemas.openxmlformats.org/drawingml/2006/main" xmlns:pic="http://schemas.openxmlformats.org/drawingml/2006/picture">
+                  <wp:extent cx="4983480" cy="3115040"/>
+                  <wp:docPr id="15" name="Picture 15"/>
+                  <wp:cNvGraphicFramePr>
+                    <a:graphicFrameLocks noChangeAspect="1"/>
+                  </wp:cNvGraphicFramePr>
+                  <a:graphic>
+                    <a:graphicData uri="http://schemas.openxmlformats.org/drawingml/2006/picture">
+                      <pic:pic>
+                        <pic:nvPicPr>
+                          <pic:cNvPr id="0" name="case08_before.png"/>
+                          <pic:cNvPicPr/>
+                        </pic:nvPicPr>
+                        <pic:blipFill>
+                          <a:blip r:embed="rId23"/>
+                          <a:stretch>
+                            <a:fillRect/>
+                          </a:stretch>
+                        </pic:blipFill>
+                        <pic:spPr>
+                          <a:xfrm>
+                            <a:off x="0" y="0"/>
+                            <a:ext cx="4983480" cy="3115040"/>
+                          </a:xfrm>
+                          <a:prstGeom prst="rect"/>
+                        </pic:spPr>
+                      </pic:pic>
+                    </a:graphicData>
+                  </a:graphic>
+                </wp:inline>
+              </w:drawing>
+            </w:r>
+          </w:p>
+          <w:p>
+            <w:pPr>
+              <w:keepNext/>
+            </w:pPr>
+            <w:r>
+              <w:rPr>
+                <w:rFonts w:ascii="宋体" w:hAnsi="宋体"/>
+                <w:sz w:val="18"/>
+              </w:rPr>
+              <w:t>图 08-2  用例 08修改后运行结果</w:t>
+            </w:r>
+          </w:p>
+          <w:p>
+            <w:pPr>
+              <w:spacing w:after="100"/>
+              <w:jc w:val="center"/>
+            </w:pPr>
+            <w:r>
+              <w:drawing>
+                <wp:inline xmlns:a="http://schemas.openxmlformats.org/drawingml/2006/main" xmlns:pic="http://schemas.openxmlformats.org/drawingml/2006/picture">
+                  <wp:extent cx="4983480" cy="3115040"/>
+                  <wp:docPr id="16" name="Picture 16"/>
+                  <wp:cNvGraphicFramePr>
+                    <a:graphicFrameLocks noChangeAspect="1"/>
+                  </wp:cNvGraphicFramePr>
+                  <a:graphic>
+                    <a:graphicData uri="http://schemas.openxmlformats.org/drawingml/2006/picture">
+                      <pic:pic>
+                        <pic:nvPicPr>
+                          <pic:cNvPr id="0" name="case08_after.png"/>
+                          <pic:cNvPicPr/>
+                        </pic:nvPicPr>
+                        <pic:blipFill>
+                          <a:blip r:embed="rId24"/>
+                          <a:stretch>
+                            <a:fillRect/>
+                          </a:stretch>
+                        </pic:blipFill>
+                        <pic:spPr>
+                          <a:xfrm>
+                            <a:off x="0" y="0"/>
+                            <a:ext cx="4983480" cy="3115040"/>
+                          </a:xfrm>
+                          <a:prstGeom prst="rect"/>
+                        </pic:spPr>
+                      </pic:pic>
+                    </a:graphicData>
+                  </a:graphic>
+                </wp:inline>
+              </w:drawing>
+            </w:r>
+          </w:p>
+          <w:p>
+            <w:pPr>
+              <w:keepNext/>
+              <w:spacing w:before="200"/>
+            </w:pPr>
+            <w:r>
+              <w:rPr>
+                <w:rFonts w:ascii="宋体" w:hAnsi="宋体"/>
+                <w:b/>
                 <w:sz w:val="21"/>
               </w:rPr>
-              <w:t>用例05：失败版结果________；通过版结果________；两张运行截图待插入。</w:t>
-            </w:r>
-          </w:p>
-          <w:p>
-            <w:pPr>
-              <w:spacing w:after="40" w:line="252" w:lineRule="auto"/>
-              <w:jc w:val="left"/>
-            </w:pPr>
-            <w:r>
-              <w:rPr>
-                <w:rFonts w:ascii="宋体" w:hAnsi="宋体" w:eastAsia="宋体"/>
-                <w:b w:val="0"/>
+              <w:t>用例 09  朝西执行 L，期望原地转为南。</w:t>
+            </w:r>
+          </w:p>
+          <w:p>
+            <w:pPr>
+              <w:keepNext/>
+            </w:pPr>
+            <w:r>
+              <w:rPr>
+                <w:rFonts w:ascii="宋体" w:hAnsi="宋体"/>
+                <w:sz w:val="20"/>
+              </w:rPr>
+              <w:t>修改内容：增加 W 到 S 的左转转换。 实测：test9-fail 返回 1，测试失败；test9 返回 0，测试通过。</w:t>
+            </w:r>
+          </w:p>
+          <w:p>
+            <w:pPr>
+              <w:keepNext/>
+            </w:pPr>
+            <w:r>
+              <w:rPr>
+                <w:rFonts w:ascii="宋体" w:hAnsi="宋体"/>
+                <w:sz w:val="18"/>
+              </w:rPr>
+              <w:t>图 09-1  用例 09修改前运行结果</w:t>
+            </w:r>
+          </w:p>
+          <w:p>
+            <w:pPr>
+              <w:spacing w:after="100"/>
+              <w:jc w:val="center"/>
+            </w:pPr>
+            <w:r>
+              <w:drawing>
+                <wp:inline xmlns:a="http://schemas.openxmlformats.org/drawingml/2006/main" xmlns:pic="http://schemas.openxmlformats.org/drawingml/2006/picture">
+                  <wp:extent cx="4983480" cy="3115040"/>
+                  <wp:docPr id="17" name="Picture 17"/>
+                  <wp:cNvGraphicFramePr>
+                    <a:graphicFrameLocks noChangeAspect="1"/>
+                  </wp:cNvGraphicFramePr>
+                  <a:graphic>
+                    <a:graphicData uri="http://schemas.openxmlformats.org/drawingml/2006/picture">
+                      <pic:pic>
+                        <pic:nvPicPr>
+                          <pic:cNvPr id="0" name="case09_before.png"/>
+                          <pic:cNvPicPr/>
+                        </pic:nvPicPr>
+                        <pic:blipFill>
+                          <a:blip r:embed="rId25"/>
+                          <a:stretch>
+                            <a:fillRect/>
+                          </a:stretch>
+                        </pic:blipFill>
+                        <pic:spPr>
+                          <a:xfrm>
+                            <a:off x="0" y="0"/>
+                            <a:ext cx="4983480" cy="3115040"/>
+                          </a:xfrm>
+                          <a:prstGeom prst="rect"/>
+                        </pic:spPr>
+                      </pic:pic>
+                    </a:graphicData>
+                  </a:graphic>
+                </wp:inline>
+              </w:drawing>
+            </w:r>
+          </w:p>
+          <w:p>
+            <w:pPr>
+              <w:keepNext/>
+            </w:pPr>
+            <w:r>
+              <w:rPr>
+                <w:rFonts w:ascii="宋体" w:hAnsi="宋体"/>
+                <w:sz w:val="18"/>
+              </w:rPr>
+              <w:t>图 09-2  用例 09修改后运行结果</w:t>
+            </w:r>
+          </w:p>
+          <w:p>
+            <w:pPr>
+              <w:spacing w:after="100"/>
+              <w:jc w:val="center"/>
+            </w:pPr>
+            <w:r>
+              <w:drawing>
+                <wp:inline xmlns:a="http://schemas.openxmlformats.org/drawingml/2006/main" xmlns:pic="http://schemas.openxmlformats.org/drawingml/2006/picture">
+                  <wp:extent cx="4983480" cy="3115040"/>
+                  <wp:docPr id="18" name="Picture 18"/>
+                  <wp:cNvGraphicFramePr>
+                    <a:graphicFrameLocks noChangeAspect="1"/>
+                  </wp:cNvGraphicFramePr>
+                  <a:graphic>
+                    <a:graphicData uri="http://schemas.openxmlformats.org/drawingml/2006/picture">
+                      <pic:pic>
+                        <pic:nvPicPr>
+                          <pic:cNvPr id="0" name="case09_after.png"/>
+                          <pic:cNvPicPr/>
+                        </pic:nvPicPr>
+                        <pic:blipFill>
+                          <a:blip r:embed="rId26"/>
+                          <a:stretch>
+                            <a:fillRect/>
+                          </a:stretch>
+                        </pic:blipFill>
+                        <pic:spPr>
+                          <a:xfrm>
+                            <a:off x="0" y="0"/>
+                            <a:ext cx="4983480" cy="3115040"/>
+                          </a:xfrm>
+                          <a:prstGeom prst="rect"/>
+                        </pic:spPr>
+                      </pic:pic>
+                    </a:graphicData>
+                  </a:graphic>
+                </wp:inline>
+              </w:drawing>
+            </w:r>
+          </w:p>
+          <w:p>
+            <w:pPr>
+              <w:keepNext/>
+              <w:spacing w:before="200"/>
+            </w:pPr>
+            <w:r>
+              <w:rPr>
+                <w:rFonts w:ascii="宋体" w:hAnsi="宋体"/>
+                <w:b/>
                 <w:sz w:val="21"/>
               </w:rPr>
-              <w:t>用例06：失败版结果________；通过版结果________；两张运行截图待插入。</w:t>
-            </w:r>
-          </w:p>
-          <w:p>
-            <w:pPr>
-              <w:spacing w:after="40" w:line="252" w:lineRule="auto"/>
-              <w:jc w:val="left"/>
-            </w:pPr>
-            <w:r>
-              <w:rPr>
-                <w:rFonts w:ascii="宋体" w:hAnsi="宋体" w:eastAsia="宋体"/>
-                <w:b w:val="0"/>
+              <w:t>用例 10  朝南执行 L，期望原地转为东。</w:t>
+            </w:r>
+          </w:p>
+          <w:p>
+            <w:pPr>
+              <w:keepNext/>
+            </w:pPr>
+            <w:r>
+              <w:rPr>
+                <w:rFonts w:ascii="宋体" w:hAnsi="宋体"/>
+                <w:sz w:val="20"/>
+              </w:rPr>
+              <w:t>修改内容：增加 S 到 E 的左转转换。 实测：test10-fail 返回 1，测试失败；test10 返回 0，测试通过。</w:t>
+            </w:r>
+          </w:p>
+          <w:p>
+            <w:pPr>
+              <w:keepNext/>
+            </w:pPr>
+            <w:r>
+              <w:rPr>
+                <w:rFonts w:ascii="宋体" w:hAnsi="宋体"/>
+                <w:sz w:val="18"/>
+              </w:rPr>
+              <w:t>图 10-1  用例 10修改前运行结果</w:t>
+            </w:r>
+          </w:p>
+          <w:p>
+            <w:pPr>
+              <w:spacing w:after="100"/>
+              <w:jc w:val="center"/>
+            </w:pPr>
+            <w:r>
+              <w:drawing>
+                <wp:inline xmlns:a="http://schemas.openxmlformats.org/drawingml/2006/main" xmlns:pic="http://schemas.openxmlformats.org/drawingml/2006/picture">
+                  <wp:extent cx="4983480" cy="3115040"/>
+                  <wp:docPr id="19" name="Picture 19"/>
+                  <wp:cNvGraphicFramePr>
+                    <a:graphicFrameLocks noChangeAspect="1"/>
+                  </wp:cNvGraphicFramePr>
+                  <a:graphic>
+                    <a:graphicData uri="http://schemas.openxmlformats.org/drawingml/2006/picture">
+                      <pic:pic>
+                        <pic:nvPicPr>
+                          <pic:cNvPr id="0" name="case10_before.png"/>
+                          <pic:cNvPicPr/>
+                        </pic:nvPicPr>
+                        <pic:blipFill>
+                          <a:blip r:embed="rId27"/>
+                          <a:stretch>
+                            <a:fillRect/>
+                          </a:stretch>
+                        </pic:blipFill>
+                        <pic:spPr>
+                          <a:xfrm>
+                            <a:off x="0" y="0"/>
+                            <a:ext cx="4983480" cy="3115040"/>
+                          </a:xfrm>
+                          <a:prstGeom prst="rect"/>
+                        </pic:spPr>
+                      </pic:pic>
+                    </a:graphicData>
+                  </a:graphic>
+                </wp:inline>
+              </w:drawing>
+            </w:r>
+          </w:p>
+          <w:p>
+            <w:pPr>
+              <w:keepNext/>
+            </w:pPr>
+            <w:r>
+              <w:rPr>
+                <w:rFonts w:ascii="宋体" w:hAnsi="宋体"/>
+                <w:sz w:val="18"/>
+              </w:rPr>
+              <w:t>图 10-2  用例 10修改后运行结果</w:t>
+            </w:r>
+          </w:p>
+          <w:p>
+            <w:pPr>
+              <w:spacing w:after="100"/>
+              <w:jc w:val="center"/>
+            </w:pPr>
+            <w:r>
+              <w:drawing>
+                <wp:inline xmlns:a="http://schemas.openxmlformats.org/drawingml/2006/main" xmlns:pic="http://schemas.openxmlformats.org/drawingml/2006/picture">
+                  <wp:extent cx="4983480" cy="3115040"/>
+                  <wp:docPr id="20" name="Picture 20"/>
+                  <wp:cNvGraphicFramePr>
+                    <a:graphicFrameLocks noChangeAspect="1"/>
+                  </wp:cNvGraphicFramePr>
+                  <a:graphic>
+                    <a:graphicData uri="http://schemas.openxmlformats.org/drawingml/2006/picture">
+                      <pic:pic>
+                        <pic:nvPicPr>
+                          <pic:cNvPr id="0" name="case10_after.png"/>
+                          <pic:cNvPicPr/>
+                        </pic:nvPicPr>
+                        <pic:blipFill>
+                          <a:blip r:embed="rId28"/>
+                          <a:stretch>
+                            <a:fillRect/>
+                          </a:stretch>
+                        </pic:blipFill>
+                        <pic:spPr>
+                          <a:xfrm>
+                            <a:off x="0" y="0"/>
+                            <a:ext cx="4983480" cy="3115040"/>
+                          </a:xfrm>
+                          <a:prstGeom prst="rect"/>
+                        </pic:spPr>
+                      </pic:pic>
+                    </a:graphicData>
+                  </a:graphic>
+                </wp:inline>
+              </w:drawing>
+            </w:r>
+          </w:p>
+          <w:p>
+            <w:pPr>
+              <w:keepNext/>
+              <w:spacing w:before="200"/>
+            </w:pPr>
+            <w:r>
+              <w:rPr>
+                <w:rFonts w:ascii="宋体" w:hAnsi="宋体"/>
+                <w:b/>
                 <w:sz w:val="21"/>
               </w:rPr>
-              <w:t>用例07：失败版结果________；通过版结果________；两张运行截图待插入。</w:t>
-            </w:r>
-          </w:p>
-          <w:p>
-            <w:pPr>
-              <w:spacing w:after="40" w:line="252" w:lineRule="auto"/>
-              <w:jc w:val="left"/>
-            </w:pPr>
-            <w:r>
-              <w:rPr>
-                <w:rFonts w:ascii="宋体" w:hAnsi="宋体" w:eastAsia="宋体"/>
-                <w:b w:val="0"/>
+              <w:t>用例 11  朝东和朝南分别执行 R，期望 E 到 S、S 到 W。</w:t>
+            </w:r>
+          </w:p>
+          <w:p>
+            <w:pPr>
+              <w:keepNext/>
+            </w:pPr>
+            <w:r>
+              <w:rPr>
+                <w:rFonts w:ascii="宋体" w:hAnsi="宋体"/>
+                <w:sz w:val="20"/>
+              </w:rPr>
+              <w:t>修改内容：增加右转处理及 E、S 两个方向的转换。 实测：test11-fail 返回 1，测试失败；test11 返回 0，测试通过。</w:t>
+            </w:r>
+          </w:p>
+          <w:p>
+            <w:pPr>
+              <w:keepNext/>
+            </w:pPr>
+            <w:r>
+              <w:rPr>
+                <w:rFonts w:ascii="宋体" w:hAnsi="宋体"/>
+                <w:sz w:val="18"/>
+              </w:rPr>
+              <w:t>图 11-1  用例 11修改前运行结果</w:t>
+            </w:r>
+          </w:p>
+          <w:p>
+            <w:pPr>
+              <w:spacing w:after="100"/>
+              <w:jc w:val="center"/>
+            </w:pPr>
+            <w:r>
+              <w:drawing>
+                <wp:inline xmlns:a="http://schemas.openxmlformats.org/drawingml/2006/main" xmlns:pic="http://schemas.openxmlformats.org/drawingml/2006/picture">
+                  <wp:extent cx="4983480" cy="3115040"/>
+                  <wp:docPr id="21" name="Picture 21"/>
+                  <wp:cNvGraphicFramePr>
+                    <a:graphicFrameLocks noChangeAspect="1"/>
+                  </wp:cNvGraphicFramePr>
+                  <a:graphic>
+                    <a:graphicData uri="http://schemas.openxmlformats.org/drawingml/2006/picture">
+                      <pic:pic>
+                        <pic:nvPicPr>
+                          <pic:cNvPr id="0" name="case11_before.png"/>
+                          <pic:cNvPicPr/>
+                        </pic:nvPicPr>
+                        <pic:blipFill>
+                          <a:blip r:embed="rId29"/>
+                          <a:stretch>
+                            <a:fillRect/>
+                          </a:stretch>
+                        </pic:blipFill>
+                        <pic:spPr>
+                          <a:xfrm>
+                            <a:off x="0" y="0"/>
+                            <a:ext cx="4983480" cy="3115040"/>
+                          </a:xfrm>
+                          <a:prstGeom prst="rect"/>
+                        </pic:spPr>
+                      </pic:pic>
+                    </a:graphicData>
+                  </a:graphic>
+                </wp:inline>
+              </w:drawing>
+            </w:r>
+          </w:p>
+          <w:p>
+            <w:pPr>
+              <w:keepNext/>
+            </w:pPr>
+            <w:r>
+              <w:rPr>
+                <w:rFonts w:ascii="宋体" w:hAnsi="宋体"/>
+                <w:sz w:val="18"/>
+              </w:rPr>
+              <w:t>图 11-2  用例 11修改后运行结果</w:t>
+            </w:r>
+          </w:p>
+          <w:p>
+            <w:pPr>
+              <w:spacing w:after="100"/>
+              <w:jc w:val="center"/>
+            </w:pPr>
+            <w:r>
+              <w:drawing>
+                <wp:inline xmlns:a="http://schemas.openxmlformats.org/drawingml/2006/main" xmlns:pic="http://schemas.openxmlformats.org/drawingml/2006/picture">
+                  <wp:extent cx="4983480" cy="3115040"/>
+                  <wp:docPr id="22" name="Picture 22"/>
+                  <wp:cNvGraphicFramePr>
+                    <a:graphicFrameLocks noChangeAspect="1"/>
+                  </wp:cNvGraphicFramePr>
+                  <a:graphic>
+                    <a:graphicData uri="http://schemas.openxmlformats.org/drawingml/2006/picture">
+                      <pic:pic>
+                        <pic:nvPicPr>
+                          <pic:cNvPr id="0" name="case11_after.png"/>
+                          <pic:cNvPicPr/>
+                        </pic:nvPicPr>
+                        <pic:blipFill>
+                          <a:blip r:embed="rId30"/>
+                          <a:stretch>
+                            <a:fillRect/>
+                          </a:stretch>
+                        </pic:blipFill>
+                        <pic:spPr>
+                          <a:xfrm>
+                            <a:off x="0" y="0"/>
+                            <a:ext cx="4983480" cy="3115040"/>
+                          </a:xfrm>
+                          <a:prstGeom prst="rect"/>
+                        </pic:spPr>
+                      </pic:pic>
+                    </a:graphicData>
+                  </a:graphic>
+                </wp:inline>
+              </w:drawing>
+            </w:r>
+          </w:p>
+          <w:p>
+            <w:pPr>
+              <w:keepNext/>
+              <w:spacing w:before="200"/>
+            </w:pPr>
+            <w:r>
+              <w:rPr>
+                <w:rFonts w:ascii="宋体" w:hAnsi="宋体"/>
+                <w:b/>
                 <w:sz w:val="21"/>
               </w:rPr>
-              <w:t>用例08：失败版结果________；通过版结果________；两张运行截图待插入。</w:t>
-            </w:r>
-          </w:p>
-          <w:p>
-            <w:pPr>
-              <w:spacing w:after="40" w:line="252" w:lineRule="auto"/>
-              <w:jc w:val="left"/>
-            </w:pPr>
-            <w:r>
-              <w:rPr>
-                <w:rFonts w:ascii="宋体" w:hAnsi="宋体" w:eastAsia="宋体"/>
-                <w:b w:val="0"/>
+              <w:t>用例 12  朝西和朝北分别执行 R，期望 W 到 N、N 到 E。</w:t>
+            </w:r>
+          </w:p>
+          <w:p>
+            <w:pPr>
+              <w:keepNext/>
+            </w:pPr>
+            <w:r>
+              <w:rPr>
+                <w:rFonts w:ascii="宋体" w:hAnsi="宋体"/>
+                <w:sz w:val="20"/>
+              </w:rPr>
+              <w:t>修改内容：补齐 W、N 两个方向的右转转换。 实测：test12-fail 返回 1，测试失败；test12 返回 0，测试通过。</w:t>
+            </w:r>
+          </w:p>
+          <w:p>
+            <w:pPr>
+              <w:keepNext/>
+            </w:pPr>
+            <w:r>
+              <w:rPr>
+                <w:rFonts w:ascii="宋体" w:hAnsi="宋体"/>
+                <w:sz w:val="18"/>
+              </w:rPr>
+              <w:t>图 12-1  用例 12修改前运行结果</w:t>
+            </w:r>
+          </w:p>
+          <w:p>
+            <w:pPr>
+              <w:spacing w:after="100"/>
+              <w:jc w:val="center"/>
+            </w:pPr>
+            <w:r>
+              <w:drawing>
+                <wp:inline xmlns:a="http://schemas.openxmlformats.org/drawingml/2006/main" xmlns:pic="http://schemas.openxmlformats.org/drawingml/2006/picture">
+                  <wp:extent cx="4983480" cy="3115040"/>
+                  <wp:docPr id="23" name="Picture 23"/>
+                  <wp:cNvGraphicFramePr>
+                    <a:graphicFrameLocks noChangeAspect="1"/>
+                  </wp:cNvGraphicFramePr>
+                  <a:graphic>
+                    <a:graphicData uri="http://schemas.openxmlformats.org/drawingml/2006/picture">
+                      <pic:pic>
+                        <pic:nvPicPr>
+                          <pic:cNvPr id="0" name="case12_before.png"/>
+                          <pic:cNvPicPr/>
+                        </pic:nvPicPr>
+                        <pic:blipFill>
+                          <a:blip r:embed="rId31"/>
+                          <a:stretch>
+                            <a:fillRect/>
+                          </a:stretch>
+                        </pic:blipFill>
+                        <pic:spPr>
+                          <a:xfrm>
+                            <a:off x="0" y="0"/>
+                            <a:ext cx="4983480" cy="3115040"/>
+                          </a:xfrm>
+                          <a:prstGeom prst="rect"/>
+                        </pic:spPr>
+                      </pic:pic>
+                    </a:graphicData>
+                  </a:graphic>
+                </wp:inline>
+              </w:drawing>
+            </w:r>
+          </w:p>
+          <w:p>
+            <w:pPr>
+              <w:keepNext/>
+            </w:pPr>
+            <w:r>
+              <w:rPr>
+                <w:rFonts w:ascii="宋体" w:hAnsi="宋体"/>
+                <w:sz w:val="18"/>
+              </w:rPr>
+              <w:t>图 12-2  用例 12修改后运行结果</w:t>
+            </w:r>
+          </w:p>
+          <w:p>
+            <w:pPr>
+              <w:spacing w:after="100"/>
+              <w:jc w:val="center"/>
+            </w:pPr>
+            <w:r>
+              <w:drawing>
+                <wp:inline xmlns:a="http://schemas.openxmlformats.org/drawingml/2006/main" xmlns:pic="http://schemas.openxmlformats.org/drawingml/2006/picture">
+                  <wp:extent cx="4983480" cy="3115040"/>
+                  <wp:docPr id="24" name="Picture 24"/>
+                  <wp:cNvGraphicFramePr>
+                    <a:graphicFrameLocks noChangeAspect="1"/>
+                  </wp:cNvGraphicFramePr>
+                  <a:graphic>
+                    <a:graphicData uri="http://schemas.openxmlformats.org/drawingml/2006/picture">
+                      <pic:pic>
+                        <pic:nvPicPr>
+                          <pic:cNvPr id="0" name="case12_after.png"/>
+                          <pic:cNvPicPr/>
+                        </pic:nvPicPr>
+                        <pic:blipFill>
+                          <a:blip r:embed="rId32"/>
+                          <a:stretch>
+                            <a:fillRect/>
+                          </a:stretch>
+                        </pic:blipFill>
+                        <pic:spPr>
+                          <a:xfrm>
+                            <a:off x="0" y="0"/>
+                            <a:ext cx="4983480" cy="3115040"/>
+                          </a:xfrm>
+                          <a:prstGeom prst="rect"/>
+                        </pic:spPr>
+                      </pic:pic>
+                    </a:graphicData>
+                  </a:graphic>
+                </wp:inline>
+              </w:drawing>
+            </w:r>
+          </w:p>
+          <w:p>
+            <w:pPr>
+              <w:keepNext/>
+              <w:spacing w:before="200"/>
+            </w:pPr>
+            <w:r>
+              <w:rPr>
+                <w:rFonts w:ascii="宋体" w:hAnsi="宋体"/>
+                <w:b/>
                 <w:sz w:val="21"/>
               </w:rPr>
-              <w:t>用例09：失败版结果________；通过版结果________；两张运行截图待插入。</w:t>
-            </w:r>
-          </w:p>
-          <w:p>
-            <w:pPr>
-              <w:spacing w:after="40" w:line="252" w:lineRule="auto"/>
-              <w:jc w:val="left"/>
-            </w:pPr>
-            <w:r>
-              <w:rPr>
-                <w:rFonts w:ascii="宋体" w:hAnsi="宋体" w:eastAsia="宋体"/>
-                <w:b w:val="0"/>
+              <w:t>用例 13  从默认状态执行 MLMMRM，期望 (-2,2,N)。</w:t>
+            </w:r>
+          </w:p>
+          <w:p>
+            <w:pPr>
+              <w:keepNext/>
+            </w:pPr>
+            <w:r>
+              <w:rPr>
+                <w:rFonts w:ascii="宋体" w:hAnsi="宋体"/>
+                <w:sz w:val="20"/>
+              </w:rPr>
+              <w:t>修改内容：把单条指令处理扩展为按顺序遍历整串指令。 实测：test13-fail 返回 1，测试失败；test13 返回 0，测试通过。</w:t>
+            </w:r>
+          </w:p>
+          <w:p>
+            <w:pPr>
+              <w:keepNext/>
+            </w:pPr>
+            <w:r>
+              <w:rPr>
+                <w:rFonts w:ascii="宋体" w:hAnsi="宋体"/>
+                <w:sz w:val="18"/>
+              </w:rPr>
+              <w:t>图 13-1  用例 13修改前运行结果</w:t>
+            </w:r>
+          </w:p>
+          <w:p>
+            <w:pPr>
+              <w:spacing w:after="100"/>
+              <w:jc w:val="center"/>
+            </w:pPr>
+            <w:r>
+              <w:drawing>
+                <wp:inline xmlns:a="http://schemas.openxmlformats.org/drawingml/2006/main" xmlns:pic="http://schemas.openxmlformats.org/drawingml/2006/picture">
+                  <wp:extent cx="4983480" cy="3115040"/>
+                  <wp:docPr id="25" name="Picture 25"/>
+                  <wp:cNvGraphicFramePr>
+                    <a:graphicFrameLocks noChangeAspect="1"/>
+                  </wp:cNvGraphicFramePr>
+                  <a:graphic>
+                    <a:graphicData uri="http://schemas.openxmlformats.org/drawingml/2006/picture">
+                      <pic:pic>
+                        <pic:nvPicPr>
+                          <pic:cNvPr id="0" name="case13_before.png"/>
+                          <pic:cNvPicPr/>
+                        </pic:nvPicPr>
+                        <pic:blipFill>
+                          <a:blip r:embed="rId33"/>
+                          <a:stretch>
+                            <a:fillRect/>
+                          </a:stretch>
+                        </pic:blipFill>
+                        <pic:spPr>
+                          <a:xfrm>
+                            <a:off x="0" y="0"/>
+                            <a:ext cx="4983480" cy="3115040"/>
+                          </a:xfrm>
+                          <a:prstGeom prst="rect"/>
+                        </pic:spPr>
+                      </pic:pic>
+                    </a:graphicData>
+                  </a:graphic>
+                </wp:inline>
+              </w:drawing>
+            </w:r>
+          </w:p>
+          <w:p>
+            <w:pPr>
+              <w:keepNext/>
+            </w:pPr>
+            <w:r>
+              <w:rPr>
+                <w:rFonts w:ascii="宋体" w:hAnsi="宋体"/>
+                <w:sz w:val="18"/>
+              </w:rPr>
+              <w:t>图 13-2  用例 13修改后运行结果</w:t>
+            </w:r>
+          </w:p>
+          <w:p>
+            <w:pPr>
+              <w:spacing w:after="100"/>
+              <w:jc w:val="center"/>
+            </w:pPr>
+            <w:r>
+              <w:drawing>
+                <wp:inline xmlns:a="http://schemas.openxmlformats.org/drawingml/2006/main" xmlns:pic="http://schemas.openxmlformats.org/drawingml/2006/picture">
+                  <wp:extent cx="4983480" cy="3115040"/>
+                  <wp:docPr id="26" name="Picture 26"/>
+                  <wp:cNvGraphicFramePr>
+                    <a:graphicFrameLocks noChangeAspect="1"/>
+                  </wp:cNvGraphicFramePr>
+                  <a:graphic>
+                    <a:graphicData uri="http://schemas.openxmlformats.org/drawingml/2006/picture">
+                      <pic:pic>
+                        <pic:nvPicPr>
+                          <pic:cNvPr id="0" name="case13_after.png"/>
+                          <pic:cNvPicPr/>
+                        </pic:nvPicPr>
+                        <pic:blipFill>
+                          <a:blip r:embed="rId34"/>
+                          <a:stretch>
+                            <a:fillRect/>
+                          </a:stretch>
+                        </pic:blipFill>
+                        <pic:spPr>
+                          <a:xfrm>
+                            <a:off x="0" y="0"/>
+                            <a:ext cx="4983480" cy="3115040"/>
+                          </a:xfrm>
+                          <a:prstGeom prst="rect"/>
+                        </pic:spPr>
+                      </pic:pic>
+                    </a:graphicData>
+                  </a:graphic>
+                </wp:inline>
+              </w:drawing>
+            </w:r>
+          </w:p>
+          <w:p>
+            <w:pPr>
+              <w:keepNext/>
+              <w:spacing w:before="200"/>
+            </w:pPr>
+            <w:r>
+              <w:rPr>
+                <w:rFonts w:ascii="宋体" w:hAnsi="宋体"/>
+                <w:b/>
                 <w:sz w:val="21"/>
               </w:rPr>
-              <w:t>用例10：失败版结果________；通过版结果________；两张运行截图待插入。</w:t>
-            </w:r>
-          </w:p>
-          <w:p>
-            <w:pPr>
-              <w:spacing w:after="40" w:line="252" w:lineRule="auto"/>
-              <w:jc w:val="left"/>
-            </w:pPr>
-            <w:r>
-              <w:rPr>
-                <w:rFonts w:ascii="宋体" w:hAnsi="宋体" w:eastAsia="宋体"/>
-                <w:b w:val="0"/>
-                <w:sz w:val="21"/>
-              </w:rPr>
-              <w:t>用例11：失败版结果________；通过版结果________；两张运行截图待插入。</w:t>
-            </w:r>
-          </w:p>
-          <w:p>
-            <w:pPr>
-              <w:spacing w:after="40" w:line="252" w:lineRule="auto"/>
-              <w:jc w:val="left"/>
-            </w:pPr>
-            <w:r>
-              <w:rPr>
-                <w:rFonts w:ascii="宋体" w:hAnsi="宋体" w:eastAsia="宋体"/>
-                <w:b w:val="0"/>
-                <w:sz w:val="21"/>
-              </w:rPr>
-              <w:t>用例12：失败版结果________；通过版结果________；两张运行截图待插入。</w:t>
-            </w:r>
-          </w:p>
-          <w:p>
-            <w:pPr>
-              <w:spacing w:after="40" w:line="252" w:lineRule="auto"/>
-              <w:jc w:val="left"/>
-            </w:pPr>
-            <w:r>
-              <w:rPr>
-                <w:rFonts w:ascii="宋体" w:hAnsi="宋体" w:eastAsia="宋体"/>
-                <w:b w:val="0"/>
-                <w:sz w:val="21"/>
-              </w:rPr>
-              <w:t>用例13：失败版结果________；通过版结果________；两张运行截图待插入。</w:t>
-            </w:r>
-          </w:p>
-          <w:p>
-            <w:pPr>
-              <w:spacing w:after="40" w:line="252" w:lineRule="auto"/>
-              <w:jc w:val="left"/>
-            </w:pPr>
-            <w:r>
-              <w:rPr>
-                <w:rFonts w:ascii="宋体" w:hAnsi="宋体" w:eastAsia="宋体"/>
-                <w:b w:val="0"/>
-                <w:sz w:val="21"/>
-              </w:rPr>
-              <w:t>用例14：失败版结果________；通过版结果________；两张运行截图待插入。</w:t>
-            </w:r>
-          </w:p>
-          <w:p>
-            <w:pPr>
-              <w:spacing w:after="40" w:line="252" w:lineRule="auto"/>
-              <w:jc w:val="left"/>
-            </w:pPr>
-            <w:r>
-              <w:rPr>
-                <w:rFonts w:ascii="宋体" w:hAnsi="宋体" w:eastAsia="宋体"/>
-                <w:b w:val="0"/>
-                <w:sz w:val="21"/>
-              </w:rPr>
-              <w:t>统一运行14个用例：结果________；截图待插入。</w:t>
+              <w:t>用例 14  从 (3,-4,S) 执行空字符串，期望状态不变且无异常。</w:t>
+            </w:r>
+          </w:p>
+          <w:p>
+            <w:pPr>
+              <w:keepNext/>
+            </w:pPr>
+            <w:r>
+              <w:rPr>
+                <w:rFonts w:ascii="宋体" w:hAnsi="宋体"/>
+                <w:sz w:val="20"/>
+              </w:rPr>
+              <w:t>修改内容：移除对空字符串首字符的访问。 实测：test14-fail 返回 1，测试失败；test14 返回 0，测试通过。</w:t>
+            </w:r>
+          </w:p>
+          <w:p>
+            <w:pPr>
+              <w:keepNext/>
+            </w:pPr>
+            <w:r>
+              <w:rPr>
+                <w:rFonts w:ascii="宋体" w:hAnsi="宋体"/>
+                <w:sz w:val="18"/>
+              </w:rPr>
+              <w:t>图 14-1  用例 14修改前运行结果</w:t>
+            </w:r>
+          </w:p>
+          <w:p>
+            <w:pPr>
+              <w:spacing w:after="100"/>
+              <w:jc w:val="center"/>
+            </w:pPr>
+            <w:r>
+              <w:drawing>
+                <wp:inline xmlns:a="http://schemas.openxmlformats.org/drawingml/2006/main" xmlns:pic="http://schemas.openxmlformats.org/drawingml/2006/picture">
+                  <wp:extent cx="4983480" cy="3115040"/>
+                  <wp:docPr id="27" name="Picture 27"/>
+                  <wp:cNvGraphicFramePr>
+                    <a:graphicFrameLocks noChangeAspect="1"/>
+                  </wp:cNvGraphicFramePr>
+                  <a:graphic>
+                    <a:graphicData uri="http://schemas.openxmlformats.org/drawingml/2006/picture">
+                      <pic:pic>
+                        <pic:nvPicPr>
+                          <pic:cNvPr id="0" name="case14_before.png"/>
+                          <pic:cNvPicPr/>
+                        </pic:nvPicPr>
+                        <pic:blipFill>
+                          <a:blip r:embed="rId35"/>
+                          <a:stretch>
+                            <a:fillRect/>
+                          </a:stretch>
+                        </pic:blipFill>
+                        <pic:spPr>
+                          <a:xfrm>
+                            <a:off x="0" y="0"/>
+                            <a:ext cx="4983480" cy="3115040"/>
+                          </a:xfrm>
+                          <a:prstGeom prst="rect"/>
+                        </pic:spPr>
+                      </pic:pic>
+                    </a:graphicData>
+                  </a:graphic>
+                </wp:inline>
+              </w:drawing>
+            </w:r>
+          </w:p>
+          <w:p>
+            <w:pPr>
+              <w:keepNext/>
+            </w:pPr>
+            <w:r>
+              <w:rPr>
+                <w:rFonts w:ascii="宋体" w:hAnsi="宋体"/>
+                <w:sz w:val="18"/>
+              </w:rPr>
+              <w:t>图 14-2  用例 14修改后运行结果</w:t>
+            </w:r>
+          </w:p>
+          <w:p>
+            <w:pPr>
+              <w:spacing w:after="100"/>
+              <w:jc w:val="center"/>
+            </w:pPr>
+            <w:r>
+              <w:drawing>
+                <wp:inline xmlns:a="http://schemas.openxmlformats.org/drawingml/2006/main" xmlns:pic="http://schemas.openxmlformats.org/drawingml/2006/picture">
+                  <wp:extent cx="4983480" cy="3115040"/>
+                  <wp:docPr id="28" name="Picture 28"/>
+                  <wp:cNvGraphicFramePr>
+                    <a:graphicFrameLocks noChangeAspect="1"/>
+                  </wp:cNvGraphicFramePr>
+                  <a:graphic>
+                    <a:graphicData uri="http://schemas.openxmlformats.org/drawingml/2006/picture">
+                      <pic:pic>
+                        <pic:nvPicPr>
+                          <pic:cNvPr id="0" name="case14_after.png"/>
+                          <pic:cNvPicPr/>
+                        </pic:nvPicPr>
+                        <pic:blipFill>
+                          <a:blip r:embed="rId36"/>
+                          <a:stretch>
+                            <a:fillRect/>
+                          </a:stretch>
+                        </pic:blipFill>
+                        <pic:spPr>
+                          <a:xfrm>
+                            <a:off x="0" y="0"/>
+                            <a:ext cx="4983480" cy="3115040"/>
+                          </a:xfrm>
+                          <a:prstGeom prst="rect"/>
+                        </pic:spPr>
+                      </pic:pic>
+                    </a:graphicData>
+                  </a:graphic>
+                </wp:inline>
+              </w:drawing>
+            </w:r>
+          </w:p>
+          <w:p>
+            <w:pPr>
+              <w:keepNext/>
+            </w:pPr>
+            <w:r>
+              <w:rPr>
+                <w:rFonts w:ascii="宋体" w:hAnsi="宋体"/>
+                <w:sz w:val="18"/>
+              </w:rPr>
+              <w:t>图 15  test14 分支完整运行的末尾输出。14 个测试全部通过，程序退出码为 0。</w:t>
+            </w:r>
+          </w:p>
+          <w:p>
+            <w:pPr>
+              <w:jc w:val="center"/>
+            </w:pPr>
+            <w:r>
+              <w:drawing>
+                <wp:inline xmlns:a="http://schemas.openxmlformats.org/drawingml/2006/main" xmlns:pic="http://schemas.openxmlformats.org/drawingml/2006/picture">
+                  <wp:extent cx="4983480" cy="3115040"/>
+                  <wp:docPr id="29" name="Picture 29"/>
+                  <wp:cNvGraphicFramePr>
+                    <a:graphicFrameLocks noChangeAspect="1"/>
+                  </wp:cNvGraphicFramePr>
+                  <a:graphic>
+                    <a:graphicData uri="http://schemas.openxmlformats.org/drawingml/2006/picture">
+                      <pic:pic>
+                        <pic:nvPicPr>
+                          <pic:cNvPr id="0" name="all14_after.png"/>
+                          <pic:cNvPicPr/>
+                        </pic:nvPicPr>
+                        <pic:blipFill>
+                          <a:blip r:embed="rId37"/>
+                          <a:stretch>
+                            <a:fillRect/>
+                          </a:stretch>
+                        </pic:blipFill>
+                        <pic:spPr>
+                          <a:xfrm>
+                            <a:off x="0" y="0"/>
+                            <a:ext cx="4983480" cy="3115040"/>
+                          </a:xfrm>
+                          <a:prstGeom prst="rect"/>
+                        </pic:spPr>
+                      </pic:pic>
+                    </a:graphicData>
+                  </a:graphic>
+                </wp:inline>
+              </w:drawing>
             </w:r>
           </w:p>
         </w:tc>
@@ -1577,32 +2921,14 @@
             <w:gridSpan w:val="2"/>
           </w:tcPr>
           <w:p>
-            <w:pPr>
-              <w:spacing w:after="40" w:line="252" w:lineRule="auto"/>
-              <w:jc w:val="left"/>
-            </w:pPr>
-            <w:r/>
             <w:r>
               <w:rPr>
                 <w:rFonts w:ascii="宋体" w:hAnsi="宋体" w:eastAsia="宋体"/>
-                <w:b/>
                 <w:sz w:val="21"/>
               </w:rPr>
               <w:t>九、实验结论：</w:t>
-            </w:r>
-          </w:p>
-          <w:p>
-            <w:pPr>
-              <w:spacing w:after="40" w:line="252" w:lineRule="auto"/>
-              <w:jc w:val="left"/>
-            </w:pPr>
-            <w:r>
-              <w:rPr>
-                <w:rFonts w:ascii="宋体" w:hAnsi="宋体" w:eastAsia="宋体"/>
-                <w:b w:val="0"/>
-                <w:sz w:val="21"/>
-              </w:rPr>
-              <w:t>14组测试和功能版本已经建立并上传，各分支均能编译。功能是否满足所有要求，待逐项运行和最终14用例统一运行后填写验收结论。</w:t>
+              <w:br/>
+              <w:t>14 组用例的失败版与修正版均在 MinGW 下成功编译。单项运行结果分别为 14 次失败、14 次通过；在最终 test14 分支统一运行时，14 个用例全部通过。实现覆盖指定与默认初始状态、四个方向的前进与左转、四个方向的右转、组合指令顺序执行和空指令处理。</w:t>
             </w:r>
           </w:p>
         </w:tc>
@@ -1623,32 +2949,14 @@
             <w:gridSpan w:val="2"/>
           </w:tcPr>
           <w:p>
-            <w:pPr>
-              <w:spacing w:after="40" w:line="252" w:lineRule="auto"/>
-              <w:jc w:val="left"/>
-            </w:pPr>
-            <w:r/>
             <w:r>
               <w:rPr>
                 <w:rFonts w:ascii="宋体" w:hAnsi="宋体" w:eastAsia="宋体"/>
-                <w:b/>
                 <w:sz w:val="21"/>
               </w:rPr>
               <w:t>十、总结及心得体会：</w:t>
-            </w:r>
-          </w:p>
-          <w:p>
-            <w:pPr>
-              <w:spacing w:after="40" w:line="252" w:lineRule="auto"/>
-              <w:jc w:val="left"/>
-            </w:pPr>
-            <w:r>
-              <w:rPr>
-                <w:rFonts w:ascii="宋体" w:hAnsi="宋体" w:eastAsia="宋体"/>
-                <w:b w:val="0"/>
-                <w:sz w:val="21"/>
-              </w:rPr>
-              <w:t>按功能拆分测试后，失败信息包含Test01～Test14编号，便于定位当前用例。分别保存失败和通过分支，可以直接比较新增测试与功能实现的关系。</w:t>
+              <w:br/>
+              <w:t>按功能逐项编写测试后，错误能对应到具体编号和输入条件。比如用例 13 在只处理首条指令时，实际位置与预期不同；改为逐字符处理后通过。用例 14 则发现直接读取空字符串首字符会抛出异常。保留每次修改前后的 Git 分支和运行截图，便于回看问题及修正过程。</w:t>
             </w:r>
           </w:p>
         </w:tc>
@@ -1669,32 +2977,14 @@
             <w:gridSpan w:val="2"/>
           </w:tcPr>
           <w:p>
-            <w:pPr>
-              <w:spacing w:after="40" w:line="252" w:lineRule="auto"/>
-              <w:jc w:val="left"/>
-            </w:pPr>
-            <w:r/>
             <w:r>
               <w:rPr>
                 <w:rFonts w:ascii="宋体" w:hAnsi="宋体" w:eastAsia="宋体"/>
-                <w:b/>
                 <w:sz w:val="21"/>
               </w:rPr>
               <w:t>十一、对本实验过程及方法、手段的改进建议：</w:t>
-            </w:r>
-          </w:p>
-          <w:p>
-            <w:pPr>
-              <w:spacing w:after="40" w:line="252" w:lineRule="auto"/>
-              <w:jc w:val="left"/>
-            </w:pPr>
-            <w:r>
-              <w:rPr>
-                <w:rFonts w:ascii="宋体" w:hAnsi="宋体" w:eastAsia="宋体"/>
-                <w:b w:val="0"/>
-                <w:sz w:val="21"/>
-              </w:rPr>
-              <w:t>每完成一个用例即保存两张截图，并在报告中记录实际输出。全部单项测试结束后再统一运行14个测试，检查新增功能是否影响已有行为。</w:t>
+              <w:br/>
+              <w:t>后续可把分支切换、构建和单项测试整理为固定命令，减少手工输入错误；提交前再运行完整测试，检查新增功能是否影响既有用例。</w:t>
             </w:r>
           </w:p>
         </w:tc>

</xml_diff>